<commit_message>
Offline top 3 backfill, Middle America removed from UI, RankedJobCard safe defaults, README and evaluation labels
</commit_message>
<xml_diff>
--- a/Job_Search_Agent_Report.docx
+++ b/Job_Search_Agent_Report.docx
@@ -29,7 +29,31 @@
           <w:sz w:val="24"/>
           <w:szCs w:val="24"/>
         </w:rPr>
-        <w:t>AI for Engineers — Assignment Report</w:t>
+        <w:t xml:space="preserve">AI for Engineers </w:t>
+      </w:r>
+      <w:r>
+        <w:rPr>
+          <w:color w:val="444444"/>
+          <w:sz w:val="24"/>
+          <w:szCs w:val="24"/>
+        </w:rPr>
+        <w:t>-</w:t>
+      </w:r>
+      <w:r>
+        <w:rPr>
+          <w:color w:val="444444"/>
+          <w:sz w:val="24"/>
+          <w:szCs w:val="24"/>
+        </w:rPr>
+        <w:t xml:space="preserve"> Assignment Report</w:t>
+      </w:r>
+      <w:r>
+        <w:rPr>
+          <w:color w:val="444444"/>
+          <w:sz w:val="24"/>
+          <w:szCs w:val="24"/>
+        </w:rPr>
+        <w:t xml:space="preserve"> – Group 3</w:t>
       </w:r>
     </w:p>
     <w:p>
@@ -82,439 +106,60 @@
     </w:p>
     <w:p>
       <w:pPr>
-        <w:spacing w:before="60"/>
-      </w:pPr>
-    </w:p>
-    <w:tbl>
-      <w:tblPr>
-        <w:tblW w:w="9360" w:type="dxa"/>
-        <w:tblBorders>
-          <w:top w:val="single" w:sz="4" w:space="0" w:color="auto"/>
-          <w:left w:val="single" w:sz="4" w:space="0" w:color="auto"/>
-          <w:bottom w:val="single" w:sz="4" w:space="0" w:color="auto"/>
-          <w:right w:val="single" w:sz="4" w:space="0" w:color="auto"/>
-          <w:insideH w:val="single" w:sz="4" w:space="0" w:color="auto"/>
-          <w:insideV w:val="single" w:sz="4" w:space="0" w:color="auto"/>
-        </w:tblBorders>
-        <w:tblCellMar>
-          <w:left w:w="10" w:type="dxa"/>
-          <w:right w:w="10" w:type="dxa"/>
-        </w:tblCellMar>
-        <w:tblLook w:val="0000" w:firstRow="0" w:lastRow="0" w:firstColumn="0" w:lastColumn="0" w:noHBand="0" w:noVBand="0"/>
-      </w:tblPr>
-      <w:tblGrid>
-        <w:gridCol w:w="1260"/>
-        <w:gridCol w:w="8100"/>
-      </w:tblGrid>
-      <w:tr>
-        <w:tblPrEx>
-          <w:tblCellMar>
-            <w:top w:w="0" w:type="dxa"/>
-            <w:bottom w:w="0" w:type="dxa"/>
-          </w:tblCellMar>
-        </w:tblPrEx>
-        <w:tc>
-          <w:tcPr>
-            <w:tcW w:w="1260" w:type="dxa"/>
-            <w:tcBorders>
-              <w:top w:val="single" w:sz="1" w:space="0" w:color="CCCCCC"/>
-              <w:left w:val="single" w:sz="1" w:space="0" w:color="CCCCCC"/>
-              <w:bottom w:val="single" w:sz="1" w:space="0" w:color="CCCCCC"/>
-              <w:right w:val="single" w:sz="1" w:space="0" w:color="CCCCCC"/>
-            </w:tcBorders>
-            <w:shd w:val="clear" w:color="auto" w:fill="1F4E79"/>
-            <w:tcMar>
-              <w:top w:w="80" w:type="dxa"/>
-              <w:left w:w="100" w:type="dxa"/>
-              <w:bottom w:w="80" w:type="dxa"/>
-              <w:right w:w="100" w:type="dxa"/>
-            </w:tcMar>
-          </w:tcPr>
-          <w:p>
-            <w:pPr>
-              <w:jc w:val="center"/>
-            </w:pPr>
-            <w:r>
-              <w:rPr>
-                <w:b/>
-                <w:bCs/>
-                <w:color w:val="FFFFFF"/>
-                <w:sz w:val="18"/>
-                <w:szCs w:val="18"/>
-              </w:rPr>
-              <w:t>INPUT</w:t>
-            </w:r>
-          </w:p>
-        </w:tc>
-        <w:tc>
-          <w:tcPr>
-            <w:tcW w:w="8100" w:type="dxa"/>
-            <w:tcBorders>
-              <w:top w:val="single" w:sz="1" w:space="0" w:color="CCCCCC"/>
-              <w:left w:val="single" w:sz="1" w:space="0" w:color="CCCCCC"/>
-              <w:bottom w:val="single" w:sz="1" w:space="0" w:color="CCCCCC"/>
-              <w:right w:val="single" w:sz="1" w:space="0" w:color="CCCCCC"/>
-            </w:tcBorders>
-            <w:shd w:val="clear" w:color="auto" w:fill="F8FBFF"/>
-            <w:tcMar>
-              <w:top w:w="80" w:type="dxa"/>
-              <w:left w:w="160" w:type="dxa"/>
-              <w:bottom w:w="80" w:type="dxa"/>
-              <w:right w:w="160" w:type="dxa"/>
-            </w:tcMar>
-          </w:tcPr>
-          <w:p>
-            <w:r>
-              <w:rPr>
-                <w:sz w:val="19"/>
-                <w:szCs w:val="19"/>
-              </w:rPr>
-              <w:t>Candidate Profile (skills, location, experience, target roles)</w:t>
-            </w:r>
-          </w:p>
-        </w:tc>
-      </w:tr>
-      <w:tr>
-        <w:tblPrEx>
-          <w:tblCellMar>
-            <w:top w:w="0" w:type="dxa"/>
-            <w:bottom w:w="0" w:type="dxa"/>
-          </w:tblCellMar>
-        </w:tblPrEx>
-        <w:tc>
-          <w:tcPr>
-            <w:tcW w:w="1260" w:type="dxa"/>
-            <w:tcBorders>
-              <w:top w:val="single" w:sz="1" w:space="0" w:color="CCCCCC"/>
-              <w:left w:val="single" w:sz="1" w:space="0" w:color="CCCCCC"/>
-              <w:bottom w:val="single" w:sz="1" w:space="0" w:color="CCCCCC"/>
-              <w:right w:val="single" w:sz="1" w:space="0" w:color="CCCCCC"/>
-            </w:tcBorders>
-            <w:shd w:val="clear" w:color="auto" w:fill="375623"/>
-            <w:tcMar>
-              <w:top w:w="80" w:type="dxa"/>
-              <w:left w:w="100" w:type="dxa"/>
-              <w:bottom w:w="80" w:type="dxa"/>
-              <w:right w:w="100" w:type="dxa"/>
-            </w:tcMar>
-          </w:tcPr>
-          <w:p>
-            <w:pPr>
-              <w:jc w:val="center"/>
-            </w:pPr>
-            <w:r>
-              <w:rPr>
-                <w:b/>
-                <w:bCs/>
-                <w:color w:val="FFFFFF"/>
-                <w:sz w:val="18"/>
-                <w:szCs w:val="18"/>
-              </w:rPr>
-              <w:t>TOOL 1</w:t>
-            </w:r>
-          </w:p>
-        </w:tc>
-        <w:tc>
-          <w:tcPr>
-            <w:tcW w:w="8100" w:type="dxa"/>
-            <w:tcBorders>
-              <w:top w:val="single" w:sz="1" w:space="0" w:color="CCCCCC"/>
-              <w:left w:val="single" w:sz="1" w:space="0" w:color="CCCCCC"/>
-              <w:bottom w:val="single" w:sz="1" w:space="0" w:color="CCCCCC"/>
-              <w:right w:val="single" w:sz="1" w:space="0" w:color="CCCCCC"/>
-            </w:tcBorders>
-            <w:shd w:val="clear" w:color="auto" w:fill="F8FBFF"/>
-            <w:tcMar>
-              <w:top w:w="80" w:type="dxa"/>
-              <w:left w:w="160" w:type="dxa"/>
-              <w:bottom w:w="80" w:type="dxa"/>
-              <w:right w:w="160" w:type="dxa"/>
-            </w:tcMar>
-          </w:tcPr>
-          <w:p>
-            <w:r>
-              <w:rPr>
-                <w:sz w:val="19"/>
-                <w:szCs w:val="19"/>
-              </w:rPr>
-              <w:t>Filtering Tool — company exclusion, location, experience, skills overlap</w:t>
-            </w:r>
-          </w:p>
-        </w:tc>
-      </w:tr>
-      <w:tr>
-        <w:tblPrEx>
-          <w:tblCellMar>
-            <w:top w:w="0" w:type="dxa"/>
-            <w:bottom w:w="0" w:type="dxa"/>
-          </w:tblCellMar>
-        </w:tblPrEx>
-        <w:tc>
-          <w:tcPr>
-            <w:tcW w:w="1260" w:type="dxa"/>
-            <w:tcBorders>
-              <w:top w:val="single" w:sz="1" w:space="0" w:color="CCCCCC"/>
-              <w:left w:val="single" w:sz="1" w:space="0" w:color="CCCCCC"/>
-              <w:bottom w:val="single" w:sz="1" w:space="0" w:color="CCCCCC"/>
-              <w:right w:val="single" w:sz="1" w:space="0" w:color="CCCCCC"/>
-            </w:tcBorders>
-            <w:shd w:val="clear" w:color="auto" w:fill="2E75B6"/>
-            <w:tcMar>
-              <w:top w:w="80" w:type="dxa"/>
-              <w:left w:w="100" w:type="dxa"/>
-              <w:bottom w:w="80" w:type="dxa"/>
-              <w:right w:w="100" w:type="dxa"/>
-            </w:tcMar>
-          </w:tcPr>
-          <w:p>
-            <w:pPr>
-              <w:jc w:val="center"/>
-            </w:pPr>
-            <w:r>
-              <w:rPr>
-                <w:b/>
-                <w:bCs/>
-                <w:color w:val="FFFFFF"/>
-                <w:sz w:val="18"/>
-                <w:szCs w:val="18"/>
-              </w:rPr>
-              <w:t>TOOL 2</w:t>
-            </w:r>
-          </w:p>
-        </w:tc>
-        <w:tc>
-          <w:tcPr>
-            <w:tcW w:w="8100" w:type="dxa"/>
-            <w:tcBorders>
-              <w:top w:val="single" w:sz="1" w:space="0" w:color="CCCCCC"/>
-              <w:left w:val="single" w:sz="1" w:space="0" w:color="CCCCCC"/>
-              <w:bottom w:val="single" w:sz="1" w:space="0" w:color="CCCCCC"/>
-              <w:right w:val="single" w:sz="1" w:space="0" w:color="CCCCCC"/>
-            </w:tcBorders>
-            <w:shd w:val="clear" w:color="auto" w:fill="F8FBFF"/>
-            <w:tcMar>
-              <w:top w:w="80" w:type="dxa"/>
-              <w:left w:w="160" w:type="dxa"/>
-              <w:bottom w:w="80" w:type="dxa"/>
-              <w:right w:w="160" w:type="dxa"/>
-            </w:tcMar>
-          </w:tcPr>
-          <w:p>
-            <w:r>
-              <w:rPr>
-                <w:sz w:val="19"/>
-                <w:szCs w:val="19"/>
-              </w:rPr>
-              <w:t>Ranking Tool — weighted scoring across 7 dimensions (0–100 scale)</w:t>
-            </w:r>
-          </w:p>
-        </w:tc>
-      </w:tr>
-      <w:tr>
-        <w:tblPrEx>
-          <w:tblCellMar>
-            <w:top w:w="0" w:type="dxa"/>
-            <w:bottom w:w="0" w:type="dxa"/>
-          </w:tblCellMar>
-        </w:tblPrEx>
-        <w:tc>
-          <w:tcPr>
-            <w:tcW w:w="1260" w:type="dxa"/>
-            <w:tcBorders>
-              <w:top w:val="single" w:sz="1" w:space="0" w:color="CCCCCC"/>
-              <w:left w:val="single" w:sz="1" w:space="0" w:color="CCCCCC"/>
-              <w:bottom w:val="single" w:sz="1" w:space="0" w:color="CCCCCC"/>
-              <w:right w:val="single" w:sz="1" w:space="0" w:color="CCCCCC"/>
-            </w:tcBorders>
-            <w:shd w:val="clear" w:color="auto" w:fill="7030A0"/>
-            <w:tcMar>
-              <w:top w:w="80" w:type="dxa"/>
-              <w:left w:w="100" w:type="dxa"/>
-              <w:bottom w:w="80" w:type="dxa"/>
-              <w:right w:w="100" w:type="dxa"/>
-            </w:tcMar>
-          </w:tcPr>
-          <w:p>
-            <w:pPr>
-              <w:jc w:val="center"/>
-            </w:pPr>
-            <w:r>
-              <w:rPr>
-                <w:b/>
-                <w:bCs/>
-                <w:color w:val="FFFFFF"/>
-                <w:sz w:val="18"/>
-                <w:szCs w:val="18"/>
-              </w:rPr>
-              <w:t>LLM</w:t>
-            </w:r>
-          </w:p>
-        </w:tc>
-        <w:tc>
-          <w:tcPr>
-            <w:tcW w:w="8100" w:type="dxa"/>
-            <w:tcBorders>
-              <w:top w:val="single" w:sz="1" w:space="0" w:color="CCCCCC"/>
-              <w:left w:val="single" w:sz="1" w:space="0" w:color="CCCCCC"/>
-              <w:bottom w:val="single" w:sz="1" w:space="0" w:color="CCCCCC"/>
-              <w:right w:val="single" w:sz="1" w:space="0" w:color="CCCCCC"/>
-            </w:tcBorders>
-            <w:shd w:val="clear" w:color="auto" w:fill="F8FBFF"/>
-            <w:tcMar>
-              <w:top w:w="80" w:type="dxa"/>
-              <w:left w:w="160" w:type="dxa"/>
-              <w:bottom w:w="80" w:type="dxa"/>
-              <w:right w:w="160" w:type="dxa"/>
-            </w:tcMar>
-          </w:tcPr>
-          <w:p>
-            <w:r>
-              <w:rPr>
-                <w:sz w:val="19"/>
-                <w:szCs w:val="19"/>
-              </w:rPr>
-              <w:t>Agent selects best job and decides next tool call</w:t>
-            </w:r>
-          </w:p>
-        </w:tc>
-      </w:tr>
-      <w:tr>
-        <w:tblPrEx>
-          <w:tblCellMar>
-            <w:top w:w="0" w:type="dxa"/>
-            <w:bottom w:w="0" w:type="dxa"/>
-          </w:tblCellMar>
-        </w:tblPrEx>
-        <w:tc>
-          <w:tcPr>
-            <w:tcW w:w="1260" w:type="dxa"/>
-            <w:tcBorders>
-              <w:top w:val="single" w:sz="1" w:space="0" w:color="CCCCCC"/>
-              <w:left w:val="single" w:sz="1" w:space="0" w:color="CCCCCC"/>
-              <w:bottom w:val="single" w:sz="1" w:space="0" w:color="CCCCCC"/>
-              <w:right w:val="single" w:sz="1" w:space="0" w:color="CCCCCC"/>
-            </w:tcBorders>
-            <w:shd w:val="clear" w:color="auto" w:fill="833C00"/>
-            <w:tcMar>
-              <w:top w:w="80" w:type="dxa"/>
-              <w:left w:w="100" w:type="dxa"/>
-              <w:bottom w:w="80" w:type="dxa"/>
-              <w:right w:w="100" w:type="dxa"/>
-            </w:tcMar>
-          </w:tcPr>
-          <w:p>
-            <w:pPr>
-              <w:jc w:val="center"/>
-            </w:pPr>
-            <w:r>
-              <w:rPr>
-                <w:b/>
-                <w:bCs/>
-                <w:color w:val="FFFFFF"/>
-                <w:sz w:val="18"/>
-                <w:szCs w:val="18"/>
-              </w:rPr>
-              <w:t>TOOL 3</w:t>
-            </w:r>
-          </w:p>
-        </w:tc>
-        <w:tc>
-          <w:tcPr>
-            <w:tcW w:w="8100" w:type="dxa"/>
-            <w:tcBorders>
-              <w:top w:val="single" w:sz="1" w:space="0" w:color="CCCCCC"/>
-              <w:left w:val="single" w:sz="1" w:space="0" w:color="CCCCCC"/>
-              <w:bottom w:val="single" w:sz="1" w:space="0" w:color="CCCCCC"/>
-              <w:right w:val="single" w:sz="1" w:space="0" w:color="CCCCCC"/>
-            </w:tcBorders>
-            <w:shd w:val="clear" w:color="auto" w:fill="F8FBFF"/>
-            <w:tcMar>
-              <w:top w:w="80" w:type="dxa"/>
-              <w:left w:w="160" w:type="dxa"/>
-              <w:bottom w:w="80" w:type="dxa"/>
-              <w:right w:w="160" w:type="dxa"/>
-            </w:tcMar>
-          </w:tcPr>
-          <w:p>
-            <w:r>
-              <w:rPr>
-                <w:sz w:val="19"/>
-                <w:szCs w:val="19"/>
-              </w:rPr>
-              <w:t>Resume Tailoring Tool — rewrite summary + exactly 2 bullets</w:t>
-            </w:r>
-          </w:p>
-        </w:tc>
-      </w:tr>
-      <w:tr>
-        <w:tblPrEx>
-          <w:tblCellMar>
-            <w:top w:w="0" w:type="dxa"/>
-            <w:bottom w:w="0" w:type="dxa"/>
-          </w:tblCellMar>
-        </w:tblPrEx>
-        <w:tc>
-          <w:tcPr>
-            <w:tcW w:w="1260" w:type="dxa"/>
-            <w:tcBorders>
-              <w:top w:val="single" w:sz="1" w:space="0" w:color="CCCCCC"/>
-              <w:left w:val="single" w:sz="1" w:space="0" w:color="CCCCCC"/>
-              <w:bottom w:val="single" w:sz="1" w:space="0" w:color="CCCCCC"/>
-              <w:right w:val="single" w:sz="1" w:space="0" w:color="CCCCCC"/>
-            </w:tcBorders>
-            <w:shd w:val="clear" w:color="auto" w:fill="404040"/>
-            <w:tcMar>
-              <w:top w:w="80" w:type="dxa"/>
-              <w:left w:w="100" w:type="dxa"/>
-              <w:bottom w:w="80" w:type="dxa"/>
-              <w:right w:w="100" w:type="dxa"/>
-            </w:tcMar>
-          </w:tcPr>
-          <w:p>
-            <w:pPr>
-              <w:jc w:val="center"/>
-            </w:pPr>
-            <w:r>
-              <w:rPr>
-                <w:b/>
-                <w:bCs/>
-                <w:color w:val="FFFFFF"/>
-                <w:sz w:val="18"/>
-                <w:szCs w:val="18"/>
-              </w:rPr>
-              <w:t>OUTPUT</w:t>
-            </w:r>
-          </w:p>
-        </w:tc>
-        <w:tc>
-          <w:tcPr>
-            <w:tcW w:w="8100" w:type="dxa"/>
-            <w:tcBorders>
-              <w:top w:val="single" w:sz="1" w:space="0" w:color="CCCCCC"/>
-              <w:left w:val="single" w:sz="1" w:space="0" w:color="CCCCCC"/>
-              <w:bottom w:val="single" w:sz="1" w:space="0" w:color="CCCCCC"/>
-              <w:right w:val="single" w:sz="1" w:space="0" w:color="CCCCCC"/>
-            </w:tcBorders>
-            <w:shd w:val="clear" w:color="auto" w:fill="F8FBFF"/>
-            <w:tcMar>
-              <w:top w:w="80" w:type="dxa"/>
-              <w:left w:w="160" w:type="dxa"/>
-              <w:bottom w:w="80" w:type="dxa"/>
-              <w:right w:w="160" w:type="dxa"/>
-            </w:tcMar>
-          </w:tcPr>
-          <w:p>
-            <w:r>
-              <w:rPr>
-                <w:sz w:val="19"/>
-                <w:szCs w:val="19"/>
-              </w:rPr>
-              <w:t>Ranked job list + tailored resume snippet</w:t>
-            </w:r>
-          </w:p>
-        </w:tc>
-      </w:tr>
-    </w:tbl>
+        <w:spacing w:before="80"/>
+      </w:pPr>
+    </w:p>
+    <w:p>
+      <w:pPr>
+        <w:spacing w:before="80"/>
+      </w:pPr>
+      <w:r>
+        <w:rPr>
+          <w:noProof/>
+        </w:rPr>
+        <w:drawing>
+          <wp:inline distT="0" distB="0" distL="0" distR="0" wp14:anchorId="7A946BD3" wp14:editId="0FC6DE7B">
+            <wp:extent cx="6375400" cy="2430145"/>
+            <wp:effectExtent l="0" t="0" r="0" b="0"/>
+            <wp:docPr id="190609290" name="Picture 2"/>
+            <wp:cNvGraphicFramePr>
+              <a:graphicFrameLocks xmlns:a="http://schemas.openxmlformats.org/drawingml/2006/main" noChangeAspect="1"/>
+            </wp:cNvGraphicFramePr>
+            <a:graphic xmlns:a="http://schemas.openxmlformats.org/drawingml/2006/main">
+              <a:graphicData uri="http://schemas.openxmlformats.org/drawingml/2006/picture">
+                <pic:pic xmlns:pic="http://schemas.openxmlformats.org/drawingml/2006/picture">
+                  <pic:nvPicPr>
+                    <pic:cNvPr id="190609290" name="Picture 190609290"/>
+                    <pic:cNvPicPr/>
+                  </pic:nvPicPr>
+                  <pic:blipFill>
+                    <a:blip r:embed="rId7" cstate="print">
+                      <a:extLst>
+                        <a:ext uri="{28A0092B-C50C-407E-A947-70E740481C1C}">
+                          <a14:useLocalDpi xmlns:a14="http://schemas.microsoft.com/office/drawing/2010/main" val="0"/>
+                        </a:ext>
+                      </a:extLst>
+                    </a:blip>
+                    <a:stretch>
+                      <a:fillRect/>
+                    </a:stretch>
+                  </pic:blipFill>
+                  <pic:spPr>
+                    <a:xfrm>
+                      <a:off x="0" y="0"/>
+                      <a:ext cx="6375400" cy="2430145"/>
+                    </a:xfrm>
+                    <a:prstGeom prst="rect">
+                      <a:avLst/>
+                    </a:prstGeom>
+                  </pic:spPr>
+                </pic:pic>
+              </a:graphicData>
+            </a:graphic>
+          </wp:inline>
+        </w:drawing>
+      </w:r>
+    </w:p>
     <w:p>
       <w:pPr>
         <w:spacing w:before="80"/>
@@ -617,19 +262,6 @@
       </w:pPr>
       <w:r>
         <w:t>Rule-based pre-screening applied to all 30 CSV jobs. Five sequential rules:</w:t>
-      </w:r>
-    </w:p>
-    <w:p>
-      <w:pPr>
-        <w:pStyle w:val="ListParagraph"/>
-        <w:numPr>
-          <w:ilvl w:val="0"/>
-          <w:numId w:val="2"/>
-        </w:numPr>
-        <w:spacing w:before="30" w:after="30"/>
-      </w:pPr>
-      <w:r>
-        <w:t>Company Exclusion — removes FAANG companies: Meta, Facebook, Amazon, Apple, Netflix, Google, Alphabet.</w:t>
       </w:r>
     </w:p>
     <w:p>
@@ -850,12 +482,6 @@
         <w:gridCol w:w="5860"/>
       </w:tblGrid>
       <w:tr>
-        <w:tblPrEx>
-          <w:tblCellMar>
-            <w:top w:w="0" w:type="dxa"/>
-            <w:bottom w:w="0" w:type="dxa"/>
-          </w:tblCellMar>
-        </w:tblPrEx>
         <w:trPr>
           <w:tblHeader/>
         </w:trPr>
@@ -951,12 +577,6 @@
         </w:tc>
       </w:tr>
       <w:tr>
-        <w:tblPrEx>
-          <w:tblCellMar>
-            <w:top w:w="0" w:type="dxa"/>
-            <w:bottom w:w="0" w:type="dxa"/>
-          </w:tblCellMar>
-        </w:tblPrEx>
         <w:tc>
           <w:tcPr>
             <w:tcW w:w="2600" w:type="dxa"/>
@@ -1040,12 +660,6 @@
         </w:tc>
       </w:tr>
       <w:tr>
-        <w:tblPrEx>
-          <w:tblCellMar>
-            <w:top w:w="0" w:type="dxa"/>
-            <w:bottom w:w="0" w:type="dxa"/>
-          </w:tblCellMar>
-        </w:tblPrEx>
         <w:tc>
           <w:tcPr>
             <w:tcW w:w="2600" w:type="dxa"/>
@@ -1129,12 +743,6 @@
         </w:tc>
       </w:tr>
       <w:tr>
-        <w:tblPrEx>
-          <w:tblCellMar>
-            <w:top w:w="0" w:type="dxa"/>
-            <w:bottom w:w="0" w:type="dxa"/>
-          </w:tblCellMar>
-        </w:tblPrEx>
         <w:tc>
           <w:tcPr>
             <w:tcW w:w="2600" w:type="dxa"/>
@@ -1218,12 +826,6 @@
         </w:tc>
       </w:tr>
       <w:tr>
-        <w:tblPrEx>
-          <w:tblCellMar>
-            <w:top w:w="0" w:type="dxa"/>
-            <w:bottom w:w="0" w:type="dxa"/>
-          </w:tblCellMar>
-        </w:tblPrEx>
         <w:tc>
           <w:tcPr>
             <w:tcW w:w="2600" w:type="dxa"/>
@@ -1307,12 +909,6 @@
         </w:tc>
       </w:tr>
       <w:tr>
-        <w:tblPrEx>
-          <w:tblCellMar>
-            <w:top w:w="0" w:type="dxa"/>
-            <w:bottom w:w="0" w:type="dxa"/>
-          </w:tblCellMar>
-        </w:tblPrEx>
         <w:tc>
           <w:tcPr>
             <w:tcW w:w="2600" w:type="dxa"/>
@@ -1396,12 +992,6 @@
         </w:tc>
       </w:tr>
       <w:tr>
-        <w:tblPrEx>
-          <w:tblCellMar>
-            <w:top w:w="0" w:type="dxa"/>
-            <w:bottom w:w="0" w:type="dxa"/>
-          </w:tblCellMar>
-        </w:tblPrEx>
         <w:tc>
           <w:tcPr>
             <w:tcW w:w="2600" w:type="dxa"/>
@@ -1425,6 +1015,7 @@
                 <w:sz w:val="19"/>
                 <w:szCs w:val="19"/>
               </w:rPr>
+              <w:lastRenderedPageBreak/>
               <w:t>Company + Salary</w:t>
             </w:r>
           </w:p>
@@ -1523,7 +1114,6 @@
           <w:sz w:val="22"/>
           <w:szCs w:val="22"/>
         </w:rPr>
-        <w:lastRenderedPageBreak/>
         <w:t xml:space="preserve">Tool 3 — Resume Tailoring </w:t>
       </w:r>
       <w:proofErr w:type="gramStart"/>
@@ -1675,12 +1265,6 @@
         <w:gridCol w:w="9360"/>
       </w:tblGrid>
       <w:tr>
-        <w:tblPrEx>
-          <w:tblCellMar>
-            <w:top w:w="0" w:type="dxa"/>
-            <w:bottom w:w="0" w:type="dxa"/>
-          </w:tblCellMar>
-        </w:tblPrEx>
         <w:tc>
           <w:tcPr>
             <w:tcW w:w="9360" w:type="dxa"/>
@@ -1715,12 +1299,6 @@
         </w:tc>
       </w:tr>
       <w:tr>
-        <w:tblPrEx>
-          <w:tblCellMar>
-            <w:top w:w="0" w:type="dxa"/>
-            <w:bottom w:w="0" w:type="dxa"/>
-          </w:tblCellMar>
-        </w:tblPrEx>
         <w:tc>
           <w:tcPr>
             <w:tcW w:w="9360" w:type="dxa"/>
@@ -1775,12 +1353,6 @@
         </w:tc>
       </w:tr>
       <w:tr>
-        <w:tblPrEx>
-          <w:tblCellMar>
-            <w:top w:w="0" w:type="dxa"/>
-            <w:bottom w:w="0" w:type="dxa"/>
-          </w:tblCellMar>
-        </w:tblPrEx>
         <w:tc>
           <w:tcPr>
             <w:tcW w:w="9360" w:type="dxa"/>
@@ -1835,12 +1407,6 @@
         </w:tc>
       </w:tr>
       <w:tr>
-        <w:tblPrEx>
-          <w:tblCellMar>
-            <w:top w:w="0" w:type="dxa"/>
-            <w:bottom w:w="0" w:type="dxa"/>
-          </w:tblCellMar>
-        </w:tblPrEx>
         <w:tc>
           <w:tcPr>
             <w:tcW w:w="9360" w:type="dxa"/>
@@ -1915,12 +1481,6 @@
         </w:tc>
       </w:tr>
       <w:tr>
-        <w:tblPrEx>
-          <w:tblCellMar>
-            <w:top w:w="0" w:type="dxa"/>
-            <w:bottom w:w="0" w:type="dxa"/>
-          </w:tblCellMar>
-        </w:tblPrEx>
         <w:tc>
           <w:tcPr>
             <w:tcW w:w="9360" w:type="dxa"/>
@@ -1955,12 +1515,6 @@
         </w:tc>
       </w:tr>
       <w:tr>
-        <w:tblPrEx>
-          <w:tblCellMar>
-            <w:top w:w="0" w:type="dxa"/>
-            <w:bottom w:w="0" w:type="dxa"/>
-          </w:tblCellMar>
-        </w:tblPrEx>
         <w:tc>
           <w:tcPr>
             <w:tcW w:w="9360" w:type="dxa"/>
@@ -1986,12 +1540,6 @@
         </w:tc>
       </w:tr>
       <w:tr>
-        <w:tblPrEx>
-          <w:tblCellMar>
-            <w:top w:w="0" w:type="dxa"/>
-            <w:bottom w:w="0" w:type="dxa"/>
-          </w:tblCellMar>
-        </w:tblPrEx>
         <w:tc>
           <w:tcPr>
             <w:tcW w:w="9360" w:type="dxa"/>
@@ -2026,12 +1574,6 @@
         </w:tc>
       </w:tr>
       <w:tr>
-        <w:tblPrEx>
-          <w:tblCellMar>
-            <w:top w:w="0" w:type="dxa"/>
-            <w:bottom w:w="0" w:type="dxa"/>
-          </w:tblCellMar>
-        </w:tblPrEx>
         <w:tc>
           <w:tcPr>
             <w:tcW w:w="9360" w:type="dxa"/>
@@ -2107,12 +1649,6 @@
         <w:gridCol w:w="9360"/>
       </w:tblGrid>
       <w:tr>
-        <w:tblPrEx>
-          <w:tblCellMar>
-            <w:top w:w="0" w:type="dxa"/>
-            <w:bottom w:w="0" w:type="dxa"/>
-          </w:tblCellMar>
-        </w:tblPrEx>
         <w:tc>
           <w:tcPr>
             <w:tcW w:w="9360" w:type="dxa"/>
@@ -2147,12 +1683,6 @@
         </w:tc>
       </w:tr>
       <w:tr>
-        <w:tblPrEx>
-          <w:tblCellMar>
-            <w:top w:w="0" w:type="dxa"/>
-            <w:bottom w:w="0" w:type="dxa"/>
-          </w:tblCellMar>
-        </w:tblPrEx>
         <w:tc>
           <w:tcPr>
             <w:tcW w:w="9360" w:type="dxa"/>
@@ -2187,12 +1717,6 @@
         </w:tc>
       </w:tr>
       <w:tr>
-        <w:tblPrEx>
-          <w:tblCellMar>
-            <w:top w:w="0" w:type="dxa"/>
-            <w:bottom w:w="0" w:type="dxa"/>
-          </w:tblCellMar>
-        </w:tblPrEx>
         <w:tc>
           <w:tcPr>
             <w:tcW w:w="9360" w:type="dxa"/>
@@ -2227,12 +1751,6 @@
         </w:tc>
       </w:tr>
       <w:tr>
-        <w:tblPrEx>
-          <w:tblCellMar>
-            <w:top w:w="0" w:type="dxa"/>
-            <w:bottom w:w="0" w:type="dxa"/>
-          </w:tblCellMar>
-        </w:tblPrEx>
         <w:tc>
           <w:tcPr>
             <w:tcW w:w="9360" w:type="dxa"/>
@@ -2277,7 +1795,10 @@
         <w:spacing w:before="40" w:after="60"/>
       </w:pPr>
       <w:r>
-        <w:t>Design rationale: temperature 0.2 for tool-calling (deterministic ordering), 0.7 for summary generation (natural language variety). Job descriptions truncated to 500 chars to reduce token cost while preserving role-critical context.</w:t>
+        <w:t>Design rationale: temperature 0.2 for tool-calling (deterministic ordering), 0.7 for summary generation (natural language variety). Job descriptions truncated to 500 chars to reduce token cost while preserving role-critical context</w:t>
+      </w:r>
+      <w:r>
+        <w:t>.</w:t>
       </w:r>
     </w:p>
     <w:p>
@@ -2312,10 +1833,13 @@
         </w:rPr>
         <w:t>4.1 Dataset</w:t>
       </w:r>
-    </w:p>
-    <w:p>
-      <w:pPr>
-        <w:spacing w:before="40" w:after="60"/>
+      <w:r>
+        <w:t xml:space="preserve"> </w:t>
+      </w:r>
+    </w:p>
+    <w:p>
+      <w:pPr>
+        <w:spacing w:before="140" w:after="60"/>
       </w:pPr>
       <w:r>
         <w:t xml:space="preserve">30 manually collected real AI/ML job postings (data/jobs_dataset.csv). Companies include Nightfall AI, </w:t>
@@ -2371,12 +1895,6 @@
         <w:gridCol w:w="7560"/>
       </w:tblGrid>
       <w:tr>
-        <w:tblPrEx>
-          <w:tblCellMar>
-            <w:top w:w="0" w:type="dxa"/>
-            <w:bottom w:w="0" w:type="dxa"/>
-          </w:tblCellMar>
-        </w:tblPrEx>
         <w:tc>
           <w:tcPr>
             <w:tcW w:w="1800" w:type="dxa"/>
@@ -2435,12 +1953,6 @@
         </w:tc>
       </w:tr>
       <w:tr>
-        <w:tblPrEx>
-          <w:tblCellMar>
-            <w:top w:w="0" w:type="dxa"/>
-            <w:bottom w:w="0" w:type="dxa"/>
-          </w:tblCellMar>
-        </w:tblPrEx>
         <w:tc>
           <w:tcPr>
             <w:tcW w:w="1800" w:type="dxa"/>
@@ -2499,12 +2011,6 @@
         </w:tc>
       </w:tr>
       <w:tr>
-        <w:tblPrEx>
-          <w:tblCellMar>
-            <w:top w:w="0" w:type="dxa"/>
-            <w:bottom w:w="0" w:type="dxa"/>
-          </w:tblCellMar>
-        </w:tblPrEx>
         <w:tc>
           <w:tcPr>
             <w:tcW w:w="1800" w:type="dxa"/>
@@ -2579,12 +2085,6 @@
         </w:tc>
       </w:tr>
       <w:tr>
-        <w:tblPrEx>
-          <w:tblCellMar>
-            <w:top w:w="0" w:type="dxa"/>
-            <w:bottom w:w="0" w:type="dxa"/>
-          </w:tblCellMar>
-        </w:tblPrEx>
         <w:tc>
           <w:tcPr>
             <w:tcW w:w="1800" w:type="dxa"/>
@@ -2610,7 +2110,6 @@
                 <w:sz w:val="19"/>
                 <w:szCs w:val="19"/>
               </w:rPr>
-              <w:lastRenderedPageBreak/>
               <w:t>Preferred Locations</w:t>
             </w:r>
           </w:p>
@@ -2644,12 +2143,6 @@
         </w:tc>
       </w:tr>
       <w:tr>
-        <w:tblPrEx>
-          <w:tblCellMar>
-            <w:top w:w="0" w:type="dxa"/>
-            <w:bottom w:w="0" w:type="dxa"/>
-          </w:tblCellMar>
-        </w:tblPrEx>
         <w:tc>
           <w:tcPr>
             <w:tcW w:w="1800" w:type="dxa"/>
@@ -2738,14 +2231,7 @@
     </w:p>
     <w:p>
       <w:pPr>
-        <w:spacing w:before="60"/>
-      </w:pPr>
-    </w:p>
-    <w:p>
-      <w:pPr>
         <w:spacing w:before="140" w:after="60"/>
-      </w:pPr>
-      <w:r>
         <w:rPr>
           <w:b/>
           <w:bCs/>
@@ -2753,760 +2239,146 @@
           <w:sz w:val="22"/>
           <w:szCs w:val="22"/>
         </w:rPr>
+      </w:pPr>
+      <w:r>
+        <w:rPr>
+          <w:b/>
+          <w:bCs/>
+          <w:color w:val="2E75B6"/>
+          <w:sz w:val="22"/>
+          <w:szCs w:val="22"/>
+        </w:rPr>
         <w:t>4.4 Ranked Output — Top 3 Jobs</w:t>
       </w:r>
-    </w:p>
-    <w:p>
-      <w:pPr>
-        <w:spacing w:before="40"/>
-      </w:pPr>
-    </w:p>
-    <w:tbl>
-      <w:tblPr>
-        <w:tblW w:w="9360" w:type="dxa"/>
-        <w:tblBorders>
-          <w:top w:val="single" w:sz="4" w:space="0" w:color="auto"/>
-          <w:left w:val="single" w:sz="4" w:space="0" w:color="auto"/>
-          <w:bottom w:val="single" w:sz="4" w:space="0" w:color="auto"/>
-          <w:right w:val="single" w:sz="4" w:space="0" w:color="auto"/>
-          <w:insideH w:val="single" w:sz="4" w:space="0" w:color="auto"/>
-          <w:insideV w:val="single" w:sz="4" w:space="0" w:color="auto"/>
-        </w:tblBorders>
-        <w:tblCellMar>
-          <w:left w:w="10" w:type="dxa"/>
-          <w:right w:w="10" w:type="dxa"/>
-        </w:tblCellMar>
-        <w:tblLook w:val="0000" w:firstRow="0" w:lastRow="0" w:firstColumn="0" w:lastColumn="0" w:noHBand="0" w:noVBand="0"/>
-      </w:tblPr>
-      <w:tblGrid>
-        <w:gridCol w:w="666"/>
-        <w:gridCol w:w="2155"/>
-        <w:gridCol w:w="1774"/>
-        <w:gridCol w:w="768"/>
-        <w:gridCol w:w="3997"/>
-      </w:tblGrid>
-      <w:tr>
-        <w:tblPrEx>
-          <w:tblCellMar>
-            <w:top w:w="0" w:type="dxa"/>
-            <w:bottom w:w="0" w:type="dxa"/>
-          </w:tblCellMar>
-        </w:tblPrEx>
-        <w:trPr>
-          <w:tblHeader/>
-        </w:trPr>
-        <w:tc>
-          <w:tcPr>
-            <w:tcW w:w="560" w:type="dxa"/>
-            <w:tcBorders>
-              <w:top w:val="single" w:sz="1" w:space="0" w:color="CCCCCC"/>
-              <w:left w:val="single" w:sz="1" w:space="0" w:color="CCCCCC"/>
-              <w:bottom w:val="single" w:sz="1" w:space="0" w:color="CCCCCC"/>
-              <w:right w:val="single" w:sz="1" w:space="0" w:color="CCCCCC"/>
-            </w:tcBorders>
-            <w:shd w:val="clear" w:color="auto" w:fill="1F4E79"/>
-            <w:tcMar>
-              <w:top w:w="70" w:type="dxa"/>
-              <w:left w:w="100" w:type="dxa"/>
-              <w:bottom w:w="70" w:type="dxa"/>
-              <w:right w:w="100" w:type="dxa"/>
-            </w:tcMar>
-          </w:tcPr>
-          <w:p>
-            <w:r>
-              <w:rPr>
-                <w:b/>
-                <w:bCs/>
-                <w:color w:val="FFFFFF"/>
-                <w:sz w:val="19"/>
-                <w:szCs w:val="19"/>
-              </w:rPr>
-              <w:t>Rank</w:t>
-            </w:r>
-          </w:p>
-        </w:tc>
-        <w:tc>
-          <w:tcPr>
-            <w:tcW w:w="2200" w:type="dxa"/>
-            <w:tcBorders>
-              <w:top w:val="single" w:sz="1" w:space="0" w:color="CCCCCC"/>
-              <w:left w:val="single" w:sz="1" w:space="0" w:color="CCCCCC"/>
-              <w:bottom w:val="single" w:sz="1" w:space="0" w:color="CCCCCC"/>
-              <w:right w:val="single" w:sz="1" w:space="0" w:color="CCCCCC"/>
-            </w:tcBorders>
-            <w:shd w:val="clear" w:color="auto" w:fill="1F4E79"/>
-            <w:tcMar>
-              <w:top w:w="70" w:type="dxa"/>
-              <w:left w:w="100" w:type="dxa"/>
-              <w:bottom w:w="70" w:type="dxa"/>
-              <w:right w:w="100" w:type="dxa"/>
-            </w:tcMar>
-          </w:tcPr>
-          <w:p>
-            <w:r>
-              <w:rPr>
-                <w:b/>
-                <w:bCs/>
-                <w:color w:val="FFFFFF"/>
-                <w:sz w:val="19"/>
-                <w:szCs w:val="19"/>
-              </w:rPr>
-              <w:t>Job Title</w:t>
-            </w:r>
-          </w:p>
-        </w:tc>
-        <w:tc>
-          <w:tcPr>
-            <w:tcW w:w="1800" w:type="dxa"/>
-            <w:tcBorders>
-              <w:top w:val="single" w:sz="1" w:space="0" w:color="CCCCCC"/>
-              <w:left w:val="single" w:sz="1" w:space="0" w:color="CCCCCC"/>
-              <w:bottom w:val="single" w:sz="1" w:space="0" w:color="CCCCCC"/>
-              <w:right w:val="single" w:sz="1" w:space="0" w:color="CCCCCC"/>
-            </w:tcBorders>
-            <w:shd w:val="clear" w:color="auto" w:fill="1F4E79"/>
-            <w:tcMar>
-              <w:top w:w="70" w:type="dxa"/>
-              <w:left w:w="100" w:type="dxa"/>
-              <w:bottom w:w="70" w:type="dxa"/>
-              <w:right w:w="100" w:type="dxa"/>
-            </w:tcMar>
-          </w:tcPr>
-          <w:p>
-            <w:r>
-              <w:rPr>
-                <w:b/>
-                <w:bCs/>
-                <w:color w:val="FFFFFF"/>
-                <w:sz w:val="19"/>
-                <w:szCs w:val="19"/>
-              </w:rPr>
-              <w:t>Company</w:t>
-            </w:r>
-          </w:p>
-        </w:tc>
-        <w:tc>
-          <w:tcPr>
-            <w:tcW w:w="700" w:type="dxa"/>
-            <w:tcBorders>
-              <w:top w:val="single" w:sz="1" w:space="0" w:color="CCCCCC"/>
-              <w:left w:val="single" w:sz="1" w:space="0" w:color="CCCCCC"/>
-              <w:bottom w:val="single" w:sz="1" w:space="0" w:color="CCCCCC"/>
-              <w:right w:val="single" w:sz="1" w:space="0" w:color="CCCCCC"/>
-            </w:tcBorders>
-            <w:shd w:val="clear" w:color="auto" w:fill="1F4E79"/>
-            <w:tcMar>
-              <w:top w:w="70" w:type="dxa"/>
-              <w:left w:w="100" w:type="dxa"/>
-              <w:bottom w:w="70" w:type="dxa"/>
-              <w:right w:w="100" w:type="dxa"/>
-            </w:tcMar>
-          </w:tcPr>
-          <w:p>
-            <w:r>
-              <w:rPr>
-                <w:b/>
-                <w:bCs/>
-                <w:color w:val="FFFFFF"/>
-                <w:sz w:val="19"/>
-                <w:szCs w:val="19"/>
-              </w:rPr>
-              <w:t>Score</w:t>
-            </w:r>
-          </w:p>
-        </w:tc>
-        <w:tc>
-          <w:tcPr>
-            <w:tcW w:w="4100" w:type="dxa"/>
-            <w:tcBorders>
-              <w:top w:val="single" w:sz="1" w:space="0" w:color="CCCCCC"/>
-              <w:left w:val="single" w:sz="1" w:space="0" w:color="CCCCCC"/>
-              <w:bottom w:val="single" w:sz="1" w:space="0" w:color="CCCCCC"/>
-              <w:right w:val="single" w:sz="1" w:space="0" w:color="CCCCCC"/>
-            </w:tcBorders>
-            <w:shd w:val="clear" w:color="auto" w:fill="1F4E79"/>
-            <w:tcMar>
-              <w:top w:w="70" w:type="dxa"/>
-              <w:left w:w="100" w:type="dxa"/>
-              <w:bottom w:w="70" w:type="dxa"/>
-              <w:right w:w="100" w:type="dxa"/>
-            </w:tcMar>
-          </w:tcPr>
-          <w:p>
-            <w:r>
-              <w:rPr>
-                <w:b/>
-                <w:bCs/>
-                <w:color w:val="FFFFFF"/>
-                <w:sz w:val="19"/>
-                <w:szCs w:val="19"/>
-              </w:rPr>
-              <w:t>Key Matched Skills</w:t>
-            </w:r>
-          </w:p>
-        </w:tc>
-      </w:tr>
-      <w:tr>
-        <w:tblPrEx>
-          <w:tblCellMar>
-            <w:top w:w="0" w:type="dxa"/>
-            <w:bottom w:w="0" w:type="dxa"/>
-          </w:tblCellMar>
-        </w:tblPrEx>
-        <w:tc>
-          <w:tcPr>
-            <w:tcW w:w="560" w:type="dxa"/>
-            <w:tcBorders>
-              <w:top w:val="single" w:sz="1" w:space="0" w:color="CCCCCC"/>
-              <w:left w:val="single" w:sz="1" w:space="0" w:color="CCCCCC"/>
-              <w:bottom w:val="single" w:sz="1" w:space="0" w:color="CCCCCC"/>
-              <w:right w:val="single" w:sz="1" w:space="0" w:color="CCCCCC"/>
-            </w:tcBorders>
-            <w:shd w:val="clear" w:color="auto" w:fill="FFFFFF"/>
-            <w:tcMar>
-              <w:top w:w="70" w:type="dxa"/>
-              <w:left w:w="100" w:type="dxa"/>
-              <w:bottom w:w="70" w:type="dxa"/>
-              <w:right w:w="100" w:type="dxa"/>
-            </w:tcMar>
-          </w:tcPr>
-          <w:p>
-            <w:r>
-              <w:rPr>
-                <w:color w:val="333333"/>
-                <w:sz w:val="19"/>
-                <w:szCs w:val="19"/>
-              </w:rPr>
-              <w:t>#1</w:t>
-            </w:r>
-          </w:p>
-        </w:tc>
-        <w:tc>
-          <w:tcPr>
-            <w:tcW w:w="2200" w:type="dxa"/>
-            <w:tcBorders>
-              <w:top w:val="single" w:sz="1" w:space="0" w:color="CCCCCC"/>
-              <w:left w:val="single" w:sz="1" w:space="0" w:color="CCCCCC"/>
-              <w:bottom w:val="single" w:sz="1" w:space="0" w:color="CCCCCC"/>
-              <w:right w:val="single" w:sz="1" w:space="0" w:color="CCCCCC"/>
-            </w:tcBorders>
-            <w:shd w:val="clear" w:color="auto" w:fill="FFFFFF"/>
-            <w:tcMar>
-              <w:top w:w="70" w:type="dxa"/>
-              <w:left w:w="100" w:type="dxa"/>
-              <w:bottom w:w="70" w:type="dxa"/>
-              <w:right w:w="100" w:type="dxa"/>
-            </w:tcMar>
-          </w:tcPr>
-          <w:p>
-            <w:r>
-              <w:rPr>
-                <w:color w:val="333333"/>
-                <w:sz w:val="19"/>
-                <w:szCs w:val="19"/>
-              </w:rPr>
-              <w:t>Machine Learning Engineer</w:t>
-            </w:r>
-          </w:p>
-        </w:tc>
-        <w:tc>
-          <w:tcPr>
-            <w:tcW w:w="1800" w:type="dxa"/>
-            <w:tcBorders>
-              <w:top w:val="single" w:sz="1" w:space="0" w:color="CCCCCC"/>
-              <w:left w:val="single" w:sz="1" w:space="0" w:color="CCCCCC"/>
-              <w:bottom w:val="single" w:sz="1" w:space="0" w:color="CCCCCC"/>
-              <w:right w:val="single" w:sz="1" w:space="0" w:color="CCCCCC"/>
-            </w:tcBorders>
-            <w:shd w:val="clear" w:color="auto" w:fill="FFFFFF"/>
-            <w:tcMar>
-              <w:top w:w="70" w:type="dxa"/>
-              <w:left w:w="100" w:type="dxa"/>
-              <w:bottom w:w="70" w:type="dxa"/>
-              <w:right w:w="100" w:type="dxa"/>
-            </w:tcMar>
-          </w:tcPr>
-          <w:p>
-            <w:r>
-              <w:rPr>
-                <w:color w:val="333333"/>
-                <w:sz w:val="19"/>
-                <w:szCs w:val="19"/>
-              </w:rPr>
-              <w:t>Get Offers</w:t>
-            </w:r>
-          </w:p>
-        </w:tc>
-        <w:tc>
-          <w:tcPr>
-            <w:tcW w:w="700" w:type="dxa"/>
-            <w:tcBorders>
-              <w:top w:val="single" w:sz="1" w:space="0" w:color="CCCCCC"/>
-              <w:left w:val="single" w:sz="1" w:space="0" w:color="CCCCCC"/>
-              <w:bottom w:val="single" w:sz="1" w:space="0" w:color="CCCCCC"/>
-              <w:right w:val="single" w:sz="1" w:space="0" w:color="CCCCCC"/>
-            </w:tcBorders>
-            <w:shd w:val="clear" w:color="auto" w:fill="FFFFFF"/>
-            <w:tcMar>
-              <w:top w:w="70" w:type="dxa"/>
-              <w:left w:w="100" w:type="dxa"/>
-              <w:bottom w:w="70" w:type="dxa"/>
-              <w:right w:w="100" w:type="dxa"/>
-            </w:tcMar>
-          </w:tcPr>
-          <w:p>
-            <w:r>
-              <w:rPr>
-                <w:b/>
-                <w:bCs/>
-                <w:color w:val="1F4E79"/>
-              </w:rPr>
-              <w:t>80.3%</w:t>
-            </w:r>
-          </w:p>
-        </w:tc>
-        <w:tc>
-          <w:tcPr>
-            <w:tcW w:w="4100" w:type="dxa"/>
-            <w:tcBorders>
-              <w:top w:val="single" w:sz="1" w:space="0" w:color="CCCCCC"/>
-              <w:left w:val="single" w:sz="1" w:space="0" w:color="CCCCCC"/>
-              <w:bottom w:val="single" w:sz="1" w:space="0" w:color="CCCCCC"/>
-              <w:right w:val="single" w:sz="1" w:space="0" w:color="CCCCCC"/>
-            </w:tcBorders>
-            <w:shd w:val="clear" w:color="auto" w:fill="FFFFFF"/>
-            <w:tcMar>
-              <w:top w:w="70" w:type="dxa"/>
-              <w:left w:w="100" w:type="dxa"/>
-              <w:bottom w:w="70" w:type="dxa"/>
-              <w:right w:w="100" w:type="dxa"/>
-            </w:tcMar>
-          </w:tcPr>
-          <w:p>
-            <w:r>
-              <w:rPr>
-                <w:color w:val="333333"/>
-                <w:sz w:val="19"/>
-                <w:szCs w:val="19"/>
-              </w:rPr>
-              <w:t xml:space="preserve">Python, </w:t>
-            </w:r>
-            <w:proofErr w:type="spellStart"/>
-            <w:r>
-              <w:rPr>
-                <w:color w:val="333333"/>
-                <w:sz w:val="19"/>
-                <w:szCs w:val="19"/>
-              </w:rPr>
-              <w:t>PyTorch</w:t>
-            </w:r>
-            <w:proofErr w:type="spellEnd"/>
-            <w:r>
-              <w:rPr>
-                <w:color w:val="333333"/>
-                <w:sz w:val="19"/>
-                <w:szCs w:val="19"/>
-              </w:rPr>
-              <w:t xml:space="preserve">, TensorFlow, </w:t>
-            </w:r>
-            <w:proofErr w:type="spellStart"/>
-            <w:r>
-              <w:rPr>
-                <w:color w:val="333333"/>
-                <w:sz w:val="19"/>
-                <w:szCs w:val="19"/>
-              </w:rPr>
-              <w:t>MLOps</w:t>
-            </w:r>
-            <w:proofErr w:type="spellEnd"/>
-            <w:r>
-              <w:rPr>
-                <w:color w:val="333333"/>
-                <w:sz w:val="19"/>
-                <w:szCs w:val="19"/>
-              </w:rPr>
-              <w:t>, Machine Learning</w:t>
-            </w:r>
-          </w:p>
-        </w:tc>
-      </w:tr>
-      <w:tr>
-        <w:tblPrEx>
-          <w:tblCellMar>
-            <w:top w:w="0" w:type="dxa"/>
-            <w:bottom w:w="0" w:type="dxa"/>
-          </w:tblCellMar>
-        </w:tblPrEx>
-        <w:tc>
-          <w:tcPr>
-            <w:tcW w:w="560" w:type="dxa"/>
-            <w:tcBorders>
-              <w:top w:val="single" w:sz="1" w:space="0" w:color="CCCCCC"/>
-              <w:left w:val="single" w:sz="1" w:space="0" w:color="CCCCCC"/>
-              <w:bottom w:val="single" w:sz="1" w:space="0" w:color="CCCCCC"/>
-              <w:right w:val="single" w:sz="1" w:space="0" w:color="CCCCCC"/>
-            </w:tcBorders>
-            <w:shd w:val="clear" w:color="auto" w:fill="F5F9FF"/>
-            <w:tcMar>
-              <w:top w:w="70" w:type="dxa"/>
-              <w:left w:w="100" w:type="dxa"/>
-              <w:bottom w:w="70" w:type="dxa"/>
-              <w:right w:w="100" w:type="dxa"/>
-            </w:tcMar>
-          </w:tcPr>
-          <w:p>
-            <w:r>
-              <w:rPr>
-                <w:color w:val="333333"/>
-                <w:sz w:val="19"/>
-                <w:szCs w:val="19"/>
-              </w:rPr>
-              <w:t>#2</w:t>
-            </w:r>
-          </w:p>
-        </w:tc>
-        <w:tc>
-          <w:tcPr>
-            <w:tcW w:w="2200" w:type="dxa"/>
-            <w:tcBorders>
-              <w:top w:val="single" w:sz="1" w:space="0" w:color="CCCCCC"/>
-              <w:left w:val="single" w:sz="1" w:space="0" w:color="CCCCCC"/>
-              <w:bottom w:val="single" w:sz="1" w:space="0" w:color="CCCCCC"/>
-              <w:right w:val="single" w:sz="1" w:space="0" w:color="CCCCCC"/>
-            </w:tcBorders>
-            <w:shd w:val="clear" w:color="auto" w:fill="F5F9FF"/>
-            <w:tcMar>
-              <w:top w:w="70" w:type="dxa"/>
-              <w:left w:w="100" w:type="dxa"/>
-              <w:bottom w:w="70" w:type="dxa"/>
-              <w:right w:w="100" w:type="dxa"/>
-            </w:tcMar>
-          </w:tcPr>
-          <w:p>
-            <w:r>
-              <w:rPr>
-                <w:color w:val="333333"/>
-                <w:sz w:val="19"/>
-                <w:szCs w:val="19"/>
-              </w:rPr>
-              <w:t>Machine Learning Engineer</w:t>
-            </w:r>
-          </w:p>
-        </w:tc>
-        <w:tc>
-          <w:tcPr>
-            <w:tcW w:w="1800" w:type="dxa"/>
-            <w:tcBorders>
-              <w:top w:val="single" w:sz="1" w:space="0" w:color="CCCCCC"/>
-              <w:left w:val="single" w:sz="1" w:space="0" w:color="CCCCCC"/>
-              <w:bottom w:val="single" w:sz="1" w:space="0" w:color="CCCCCC"/>
-              <w:right w:val="single" w:sz="1" w:space="0" w:color="CCCCCC"/>
-            </w:tcBorders>
-            <w:shd w:val="clear" w:color="auto" w:fill="F5F9FF"/>
-            <w:tcMar>
-              <w:top w:w="70" w:type="dxa"/>
-              <w:left w:w="100" w:type="dxa"/>
-              <w:bottom w:w="70" w:type="dxa"/>
-              <w:right w:w="100" w:type="dxa"/>
-            </w:tcMar>
-          </w:tcPr>
-          <w:p>
-            <w:r>
-              <w:rPr>
-                <w:color w:val="333333"/>
-                <w:sz w:val="19"/>
-                <w:szCs w:val="19"/>
-              </w:rPr>
-              <w:t>Barrington James</w:t>
-            </w:r>
-          </w:p>
-        </w:tc>
-        <w:tc>
-          <w:tcPr>
-            <w:tcW w:w="700" w:type="dxa"/>
-            <w:tcBorders>
-              <w:top w:val="single" w:sz="1" w:space="0" w:color="CCCCCC"/>
-              <w:left w:val="single" w:sz="1" w:space="0" w:color="CCCCCC"/>
-              <w:bottom w:val="single" w:sz="1" w:space="0" w:color="CCCCCC"/>
-              <w:right w:val="single" w:sz="1" w:space="0" w:color="CCCCCC"/>
-            </w:tcBorders>
-            <w:shd w:val="clear" w:color="auto" w:fill="F5F9FF"/>
-            <w:tcMar>
-              <w:top w:w="70" w:type="dxa"/>
-              <w:left w:w="100" w:type="dxa"/>
-              <w:bottom w:w="70" w:type="dxa"/>
-              <w:right w:w="100" w:type="dxa"/>
-            </w:tcMar>
-          </w:tcPr>
-          <w:p>
-            <w:r>
-              <w:rPr>
-                <w:b/>
-                <w:bCs/>
-                <w:color w:val="1F4E79"/>
-              </w:rPr>
-              <w:t>80.2%</w:t>
-            </w:r>
-          </w:p>
-        </w:tc>
-        <w:tc>
-          <w:tcPr>
-            <w:tcW w:w="4100" w:type="dxa"/>
-            <w:tcBorders>
-              <w:top w:val="single" w:sz="1" w:space="0" w:color="CCCCCC"/>
-              <w:left w:val="single" w:sz="1" w:space="0" w:color="CCCCCC"/>
-              <w:bottom w:val="single" w:sz="1" w:space="0" w:color="CCCCCC"/>
-              <w:right w:val="single" w:sz="1" w:space="0" w:color="CCCCCC"/>
-            </w:tcBorders>
-            <w:shd w:val="clear" w:color="auto" w:fill="F5F9FF"/>
-            <w:tcMar>
-              <w:top w:w="70" w:type="dxa"/>
-              <w:left w:w="100" w:type="dxa"/>
-              <w:bottom w:w="70" w:type="dxa"/>
-              <w:right w:w="100" w:type="dxa"/>
-            </w:tcMar>
-          </w:tcPr>
-          <w:p>
-            <w:proofErr w:type="spellStart"/>
-            <w:r>
-              <w:rPr>
-                <w:color w:val="333333"/>
-                <w:sz w:val="19"/>
-                <w:szCs w:val="19"/>
-              </w:rPr>
-              <w:t>PyTorch</w:t>
-            </w:r>
-            <w:proofErr w:type="spellEnd"/>
-            <w:r>
-              <w:rPr>
-                <w:color w:val="333333"/>
-                <w:sz w:val="19"/>
-                <w:szCs w:val="19"/>
-              </w:rPr>
-              <w:t>, TensorFlow, Machine Learning, Computer Vision</w:t>
-            </w:r>
-          </w:p>
-        </w:tc>
-      </w:tr>
-      <w:tr>
-        <w:tblPrEx>
-          <w:tblCellMar>
-            <w:top w:w="0" w:type="dxa"/>
-            <w:bottom w:w="0" w:type="dxa"/>
-          </w:tblCellMar>
-        </w:tblPrEx>
-        <w:tc>
-          <w:tcPr>
-            <w:tcW w:w="560" w:type="dxa"/>
-            <w:tcBorders>
-              <w:top w:val="single" w:sz="1" w:space="0" w:color="CCCCCC"/>
-              <w:left w:val="single" w:sz="1" w:space="0" w:color="CCCCCC"/>
-              <w:bottom w:val="single" w:sz="1" w:space="0" w:color="CCCCCC"/>
-              <w:right w:val="single" w:sz="1" w:space="0" w:color="CCCCCC"/>
-            </w:tcBorders>
-            <w:shd w:val="clear" w:color="auto" w:fill="FFFFFF"/>
-            <w:tcMar>
-              <w:top w:w="70" w:type="dxa"/>
-              <w:left w:w="100" w:type="dxa"/>
-              <w:bottom w:w="70" w:type="dxa"/>
-              <w:right w:w="100" w:type="dxa"/>
-            </w:tcMar>
-          </w:tcPr>
-          <w:p>
-            <w:r>
-              <w:rPr>
-                <w:color w:val="333333"/>
-                <w:sz w:val="19"/>
-                <w:szCs w:val="19"/>
-              </w:rPr>
-              <w:t>#3</w:t>
-            </w:r>
-          </w:p>
-        </w:tc>
-        <w:tc>
-          <w:tcPr>
-            <w:tcW w:w="2200" w:type="dxa"/>
-            <w:tcBorders>
-              <w:top w:val="single" w:sz="1" w:space="0" w:color="CCCCCC"/>
-              <w:left w:val="single" w:sz="1" w:space="0" w:color="CCCCCC"/>
-              <w:bottom w:val="single" w:sz="1" w:space="0" w:color="CCCCCC"/>
-              <w:right w:val="single" w:sz="1" w:space="0" w:color="CCCCCC"/>
-            </w:tcBorders>
-            <w:shd w:val="clear" w:color="auto" w:fill="FFFFFF"/>
-            <w:tcMar>
-              <w:top w:w="70" w:type="dxa"/>
-              <w:left w:w="100" w:type="dxa"/>
-              <w:bottom w:w="70" w:type="dxa"/>
-              <w:right w:w="100" w:type="dxa"/>
-            </w:tcMar>
-          </w:tcPr>
-          <w:p>
-            <w:r>
-              <w:rPr>
-                <w:color w:val="333333"/>
-                <w:sz w:val="19"/>
-                <w:szCs w:val="19"/>
-              </w:rPr>
-              <w:t>Data Scientist</w:t>
-            </w:r>
-          </w:p>
-        </w:tc>
-        <w:tc>
-          <w:tcPr>
-            <w:tcW w:w="1800" w:type="dxa"/>
-            <w:tcBorders>
-              <w:top w:val="single" w:sz="1" w:space="0" w:color="CCCCCC"/>
-              <w:left w:val="single" w:sz="1" w:space="0" w:color="CCCCCC"/>
-              <w:bottom w:val="single" w:sz="1" w:space="0" w:color="CCCCCC"/>
-              <w:right w:val="single" w:sz="1" w:space="0" w:color="CCCCCC"/>
-            </w:tcBorders>
-            <w:shd w:val="clear" w:color="auto" w:fill="FFFFFF"/>
-            <w:tcMar>
-              <w:top w:w="70" w:type="dxa"/>
-              <w:left w:w="100" w:type="dxa"/>
-              <w:bottom w:w="70" w:type="dxa"/>
-              <w:right w:w="100" w:type="dxa"/>
-            </w:tcMar>
-          </w:tcPr>
-          <w:p>
-            <w:r>
-              <w:rPr>
-                <w:color w:val="333333"/>
-                <w:sz w:val="19"/>
-                <w:szCs w:val="19"/>
-              </w:rPr>
-              <w:t>Zest AI</w:t>
-            </w:r>
-          </w:p>
-        </w:tc>
-        <w:tc>
-          <w:tcPr>
-            <w:tcW w:w="700" w:type="dxa"/>
-            <w:tcBorders>
-              <w:top w:val="single" w:sz="1" w:space="0" w:color="CCCCCC"/>
-              <w:left w:val="single" w:sz="1" w:space="0" w:color="CCCCCC"/>
-              <w:bottom w:val="single" w:sz="1" w:space="0" w:color="CCCCCC"/>
-              <w:right w:val="single" w:sz="1" w:space="0" w:color="CCCCCC"/>
-            </w:tcBorders>
-            <w:shd w:val="clear" w:color="auto" w:fill="FFFFFF"/>
-            <w:tcMar>
-              <w:top w:w="70" w:type="dxa"/>
-              <w:left w:w="100" w:type="dxa"/>
-              <w:bottom w:w="70" w:type="dxa"/>
-              <w:right w:w="100" w:type="dxa"/>
-            </w:tcMar>
-          </w:tcPr>
-          <w:p>
-            <w:r>
-              <w:rPr>
-                <w:b/>
-                <w:bCs/>
-                <w:color w:val="1F4E79"/>
-              </w:rPr>
-              <w:t>74.0%</w:t>
-            </w:r>
-          </w:p>
-        </w:tc>
-        <w:tc>
-          <w:tcPr>
-            <w:tcW w:w="4100" w:type="dxa"/>
-            <w:tcBorders>
-              <w:top w:val="single" w:sz="1" w:space="0" w:color="CCCCCC"/>
-              <w:left w:val="single" w:sz="1" w:space="0" w:color="CCCCCC"/>
-              <w:bottom w:val="single" w:sz="1" w:space="0" w:color="CCCCCC"/>
-              <w:right w:val="single" w:sz="1" w:space="0" w:color="CCCCCC"/>
-            </w:tcBorders>
-            <w:shd w:val="clear" w:color="auto" w:fill="FFFFFF"/>
-            <w:tcMar>
-              <w:top w:w="70" w:type="dxa"/>
-              <w:left w:w="100" w:type="dxa"/>
-              <w:bottom w:w="70" w:type="dxa"/>
-              <w:right w:w="100" w:type="dxa"/>
-            </w:tcMar>
-          </w:tcPr>
-          <w:p>
-            <w:r>
-              <w:rPr>
-                <w:color w:val="333333"/>
-                <w:sz w:val="19"/>
-                <w:szCs w:val="19"/>
-              </w:rPr>
-              <w:t xml:space="preserve">Python, scikit-learn, Machine Learning, </w:t>
-            </w:r>
-            <w:proofErr w:type="spellStart"/>
-            <w:r>
-              <w:rPr>
-                <w:color w:val="333333"/>
-                <w:sz w:val="19"/>
-                <w:szCs w:val="19"/>
-              </w:rPr>
-              <w:t>XGBoost</w:t>
-            </w:r>
-            <w:proofErr w:type="spellEnd"/>
-          </w:p>
-        </w:tc>
-      </w:tr>
-    </w:tbl>
-    <w:p>
-      <w:pPr>
-        <w:spacing w:before="100"/>
-      </w:pPr>
-    </w:p>
-    <w:p>
-      <w:pPr>
-        <w:spacing w:before="40" w:after="60"/>
-      </w:pPr>
-      <w:r>
-        <w:t>#1 Get Offers (80.3%) — Remote contract ($70–250/</w:t>
-      </w:r>
-      <w:proofErr w:type="spellStart"/>
-      <w:r>
-        <w:t>hr</w:t>
-      </w:r>
-      <w:proofErr w:type="spellEnd"/>
-      <w:r>
-        <w:t xml:space="preserve">). Requires Python, </w:t>
-      </w:r>
-      <w:proofErr w:type="spellStart"/>
-      <w:r>
-        <w:t>PyTorch</w:t>
-      </w:r>
-      <w:proofErr w:type="spellEnd"/>
-      <w:r>
-        <w:t xml:space="preserve">, TensorFlow, </w:t>
-      </w:r>
-      <w:proofErr w:type="spellStart"/>
-      <w:r>
-        <w:t>MLOps</w:t>
-      </w:r>
-      <w:proofErr w:type="spellEnd"/>
-      <w:r>
-        <w:t>, Go. Title and skill match both near-perfect; experience requirement (3 yrs) exactly met.</w:t>
-      </w:r>
-    </w:p>
-    <w:p>
-      <w:pPr>
-        <w:spacing w:before="40" w:after="60"/>
-      </w:pPr>
-      <w:r>
-        <w:t xml:space="preserve">#2 Barrington James (80.2%) — Fully remote, $150k–$170k. Cancer AI company, FDA-cleared product. Strong </w:t>
-      </w:r>
-      <w:proofErr w:type="spellStart"/>
-      <w:r>
-        <w:t>PyTorch</w:t>
-      </w:r>
-      <w:proofErr w:type="spellEnd"/>
-      <w:r>
-        <w:t>/TensorFlow match; marginally lower score as computer vision is peripheral to candidate profile.</w:t>
-      </w:r>
-    </w:p>
-    <w:p>
-      <w:pPr>
-        <w:spacing w:before="40" w:after="60"/>
-      </w:pPr>
-      <w:r>
-        <w:t>#3 Zest AI (74.0%) — US-based, no experience requirement. Consumer credit ML platform. Good Python/scikit-learn overlap but lacks deep learning frameworks, pulling title match and skill score down.</w:t>
-      </w:r>
+      <w:r>
+        <w:rPr>
+          <w:b/>
+          <w:bCs/>
+          <w:noProof/>
+          <w:color w:val="2E75B6"/>
+          <w:sz w:val="22"/>
+          <w:szCs w:val="22"/>
+        </w:rPr>
+        <w:drawing>
+          <wp:inline distT="0" distB="0" distL="0" distR="0" wp14:anchorId="46673D93" wp14:editId="1AF72FE1">
+            <wp:extent cx="6443980" cy="3021874"/>
+            <wp:effectExtent l="0" t="0" r="0" b="1270"/>
+            <wp:docPr id="687243519" name="Picture 1"/>
+            <wp:cNvGraphicFramePr>
+              <a:graphicFrameLocks xmlns:a="http://schemas.openxmlformats.org/drawingml/2006/main" noChangeAspect="1"/>
+            </wp:cNvGraphicFramePr>
+            <a:graphic xmlns:a="http://schemas.openxmlformats.org/drawingml/2006/main">
+              <a:graphicData uri="http://schemas.openxmlformats.org/drawingml/2006/picture">
+                <pic:pic xmlns:pic="http://schemas.openxmlformats.org/drawingml/2006/picture">
+                  <pic:nvPicPr>
+                    <pic:cNvPr id="687243519" name="Picture 687243519"/>
+                    <pic:cNvPicPr/>
+                  </pic:nvPicPr>
+                  <pic:blipFill>
+                    <a:blip r:embed="rId8" cstate="print">
+                      <a:extLst>
+                        <a:ext uri="{28A0092B-C50C-407E-A947-70E740481C1C}">
+                          <a14:useLocalDpi xmlns:a14="http://schemas.microsoft.com/office/drawing/2010/main" val="0"/>
+                        </a:ext>
+                      </a:extLst>
+                    </a:blip>
+                    <a:stretch>
+                      <a:fillRect/>
+                    </a:stretch>
+                  </pic:blipFill>
+                  <pic:spPr>
+                    <a:xfrm>
+                      <a:off x="0" y="0"/>
+                      <a:ext cx="6496759" cy="3046624"/>
+                    </a:xfrm>
+                    <a:prstGeom prst="rect">
+                      <a:avLst/>
+                    </a:prstGeom>
+                  </pic:spPr>
+                </pic:pic>
+              </a:graphicData>
+            </a:graphic>
+          </wp:inline>
+        </w:drawing>
+      </w:r>
+    </w:p>
+    <w:p>
+      <w:pPr>
+        <w:spacing w:before="140" w:after="60"/>
+        <w:rPr>
+          <w:b/>
+          <w:bCs/>
+          <w:color w:val="2E75B6"/>
+          <w:sz w:val="22"/>
+          <w:szCs w:val="22"/>
+        </w:rPr>
+      </w:pPr>
+    </w:p>
+    <w:p>
+      <w:pPr>
+        <w:spacing w:before="140" w:after="60"/>
+      </w:pPr>
+      <w:r>
+        <w:rPr>
+          <w:noProof/>
+        </w:rPr>
+        <w:drawing>
+          <wp:inline distT="0" distB="0" distL="0" distR="0" wp14:anchorId="64A53F9D" wp14:editId="6449E159">
+            <wp:extent cx="6375400" cy="1589405"/>
+            <wp:effectExtent l="0" t="0" r="0" b="0"/>
+            <wp:docPr id="1420505340" name="Picture 4"/>
+            <wp:cNvGraphicFramePr>
+              <a:graphicFrameLocks xmlns:a="http://schemas.openxmlformats.org/drawingml/2006/main" noChangeAspect="1"/>
+            </wp:cNvGraphicFramePr>
+            <a:graphic xmlns:a="http://schemas.openxmlformats.org/drawingml/2006/main">
+              <a:graphicData uri="http://schemas.openxmlformats.org/drawingml/2006/picture">
+                <pic:pic xmlns:pic="http://schemas.openxmlformats.org/drawingml/2006/picture">
+                  <pic:nvPicPr>
+                    <pic:cNvPr id="1420505340" name="Picture 1420505340"/>
+                    <pic:cNvPicPr/>
+                  </pic:nvPicPr>
+                  <pic:blipFill>
+                    <a:blip r:embed="rId9" cstate="print">
+                      <a:extLst>
+                        <a:ext uri="{28A0092B-C50C-407E-A947-70E740481C1C}">
+                          <a14:useLocalDpi xmlns:a14="http://schemas.microsoft.com/office/drawing/2010/main" val="0"/>
+                        </a:ext>
+                      </a:extLst>
+                    </a:blip>
+                    <a:stretch>
+                      <a:fillRect/>
+                    </a:stretch>
+                  </pic:blipFill>
+                  <pic:spPr>
+                    <a:xfrm>
+                      <a:off x="0" y="0"/>
+                      <a:ext cx="6375400" cy="1589405"/>
+                    </a:xfrm>
+                    <a:prstGeom prst="rect">
+                      <a:avLst/>
+                    </a:prstGeom>
+                  </pic:spPr>
+                </pic:pic>
+              </a:graphicData>
+            </a:graphic>
+          </wp:inline>
+        </w:drawing>
+      </w:r>
+    </w:p>
+    <w:p>
+      <w:pPr>
+        <w:spacing w:before="140" w:after="60"/>
+      </w:pPr>
+    </w:p>
+    <w:p>
+      <w:pPr>
+        <w:spacing w:before="140" w:after="60"/>
+      </w:pPr>
+    </w:p>
+    <w:p>
+      <w:pPr>
+        <w:spacing w:before="140" w:after="60"/>
+      </w:pPr>
     </w:p>
     <w:p>
       <w:pPr>
@@ -3523,6 +2395,7 @@
           <w:sz w:val="26"/>
           <w:szCs w:val="26"/>
         </w:rPr>
+        <w:lastRenderedPageBreak/>
         <w:t xml:space="preserve">5. Tailored Resume </w:t>
       </w:r>
       <w:proofErr w:type="gramStart"/>
@@ -3560,174 +2433,59 @@
           <w:sz w:val="22"/>
           <w:szCs w:val="22"/>
         </w:rPr>
-        <w:t>Rewritten Professional Summary</w:t>
-      </w:r>
-    </w:p>
-    <w:tbl>
-      <w:tblPr>
-        <w:tblW w:w="9360" w:type="dxa"/>
-        <w:tblBorders>
-          <w:top w:val="single" w:sz="4" w:space="0" w:color="auto"/>
-          <w:left w:val="single" w:sz="4" w:space="0" w:color="auto"/>
-          <w:bottom w:val="single" w:sz="4" w:space="0" w:color="auto"/>
-          <w:right w:val="single" w:sz="4" w:space="0" w:color="auto"/>
-          <w:insideH w:val="single" w:sz="4" w:space="0" w:color="auto"/>
-          <w:insideV w:val="single" w:sz="4" w:space="0" w:color="auto"/>
-        </w:tblBorders>
-        <w:tblCellMar>
-          <w:left w:w="10" w:type="dxa"/>
-          <w:right w:w="10" w:type="dxa"/>
-        </w:tblCellMar>
-        <w:tblLook w:val="0000" w:firstRow="0" w:lastRow="0" w:firstColumn="0" w:lastColumn="0" w:noHBand="0" w:noVBand="0"/>
-      </w:tblPr>
-      <w:tblGrid>
-        <w:gridCol w:w="9360"/>
-      </w:tblGrid>
-      <w:tr>
-        <w:tblPrEx>
-          <w:tblCellMar>
-            <w:top w:w="0" w:type="dxa"/>
-            <w:bottom w:w="0" w:type="dxa"/>
-          </w:tblCellMar>
-        </w:tblPrEx>
-        <w:tc>
-          <w:tcPr>
-            <w:tcW w:w="9360" w:type="dxa"/>
-            <w:tcBorders>
-              <w:top w:val="none" w:sz="0" w:space="0" w:color="FFFFFF"/>
-              <w:left w:val="none" w:sz="0" w:space="0" w:color="FFFFFF"/>
-              <w:bottom w:val="none" w:sz="0" w:space="0" w:color="FFFFFF"/>
-              <w:right w:val="none" w:sz="0" w:space="0" w:color="FFFFFF"/>
-            </w:tcBorders>
-            <w:shd w:val="clear" w:color="auto" w:fill="EBF3FB"/>
-            <w:tcMar>
-              <w:top w:w="60" w:type="dxa"/>
-              <w:left w:w="180" w:type="dxa"/>
-              <w:bottom w:w="60" w:type="dxa"/>
-              <w:right w:w="180" w:type="dxa"/>
-            </w:tcMar>
-          </w:tcPr>
-          <w:p>
-            <w:pPr>
-              <w:spacing w:before="20" w:after="20"/>
-            </w:pPr>
-            <w:r>
-              <w:rPr>
-                <w:rFonts w:ascii="Courier New" w:eastAsia="Courier New" w:hAnsi="Courier New" w:cs="Courier New"/>
-                <w:color w:val="333333"/>
-                <w:sz w:val="19"/>
-                <w:szCs w:val="19"/>
-              </w:rPr>
-              <w:t>Experienced AI / ML Engineer with 3+ years specializing in machine learning</w:t>
-            </w:r>
-          </w:p>
-        </w:tc>
-      </w:tr>
-      <w:tr>
-        <w:tblPrEx>
-          <w:tblCellMar>
-            <w:top w:w="0" w:type="dxa"/>
-            <w:bottom w:w="0" w:type="dxa"/>
-          </w:tblCellMar>
-        </w:tblPrEx>
-        <w:tc>
-          <w:tcPr>
-            <w:tcW w:w="9360" w:type="dxa"/>
-            <w:tcBorders>
-              <w:top w:val="none" w:sz="0" w:space="0" w:color="FFFFFF"/>
-              <w:left w:val="none" w:sz="0" w:space="0" w:color="FFFFFF"/>
-              <w:bottom w:val="none" w:sz="0" w:space="0" w:color="FFFFFF"/>
-              <w:right w:val="none" w:sz="0" w:space="0" w:color="FFFFFF"/>
-            </w:tcBorders>
-            <w:shd w:val="clear" w:color="auto" w:fill="EBF3FB"/>
-            <w:tcMar>
-              <w:top w:w="60" w:type="dxa"/>
-              <w:left w:w="180" w:type="dxa"/>
-              <w:bottom w:w="60" w:type="dxa"/>
-              <w:right w:w="180" w:type="dxa"/>
-            </w:tcMar>
-          </w:tcPr>
-          <w:p>
-            <w:pPr>
-              <w:spacing w:before="20" w:after="20"/>
-            </w:pPr>
-            <w:r>
-              <w:rPr>
-                <w:rFonts w:ascii="Courier New" w:eastAsia="Courier New" w:hAnsi="Courier New" w:cs="Courier New"/>
-                <w:color w:val="333333"/>
-                <w:sz w:val="19"/>
-                <w:szCs w:val="19"/>
-              </w:rPr>
-              <w:t xml:space="preserve">systems and </w:t>
-            </w:r>
-            <w:proofErr w:type="spellStart"/>
-            <w:r>
-              <w:rPr>
-                <w:rFonts w:ascii="Courier New" w:eastAsia="Courier New" w:hAnsi="Courier New" w:cs="Courier New"/>
-                <w:color w:val="333333"/>
-                <w:sz w:val="19"/>
-                <w:szCs w:val="19"/>
-              </w:rPr>
-              <w:t>MLOps</w:t>
-            </w:r>
-            <w:proofErr w:type="spellEnd"/>
-            <w:r>
-              <w:rPr>
-                <w:rFonts w:ascii="Courier New" w:eastAsia="Courier New" w:hAnsi="Courier New" w:cs="Courier New"/>
-                <w:color w:val="333333"/>
-                <w:sz w:val="19"/>
-                <w:szCs w:val="19"/>
-              </w:rPr>
-              <w:t>. Strong background in Machine Learning, NLP, and Python.</w:t>
-            </w:r>
-          </w:p>
-        </w:tc>
-      </w:tr>
-      <w:tr>
-        <w:tblPrEx>
-          <w:tblCellMar>
-            <w:top w:w="0" w:type="dxa"/>
-            <w:bottom w:w="0" w:type="dxa"/>
-          </w:tblCellMar>
-        </w:tblPrEx>
-        <w:tc>
-          <w:tcPr>
-            <w:tcW w:w="9360" w:type="dxa"/>
-            <w:tcBorders>
-              <w:top w:val="none" w:sz="0" w:space="0" w:color="FFFFFF"/>
-              <w:left w:val="none" w:sz="0" w:space="0" w:color="FFFFFF"/>
-              <w:bottom w:val="none" w:sz="0" w:space="0" w:color="FFFFFF"/>
-              <w:right w:val="none" w:sz="0" w:space="0" w:color="FFFFFF"/>
-            </w:tcBorders>
-            <w:shd w:val="clear" w:color="auto" w:fill="EBF3FB"/>
-            <w:tcMar>
-              <w:top w:w="60" w:type="dxa"/>
-              <w:left w:w="180" w:type="dxa"/>
-              <w:bottom w:w="60" w:type="dxa"/>
-              <w:right w:w="180" w:type="dxa"/>
-            </w:tcMar>
-          </w:tcPr>
-          <w:p>
-            <w:pPr>
-              <w:spacing w:before="20" w:after="20"/>
-            </w:pPr>
-            <w:r>
-              <w:rPr>
-                <w:rFonts w:ascii="Courier New" w:eastAsia="Courier New" w:hAnsi="Courier New" w:cs="Courier New"/>
-                <w:color w:val="333333"/>
-                <w:sz w:val="19"/>
-                <w:szCs w:val="19"/>
-              </w:rPr>
-              <w:t>Committed to building scalable, production-ready ML pipelines.</w:t>
-            </w:r>
-          </w:p>
-        </w:tc>
-      </w:tr>
-    </w:tbl>
+        <w:t>LLM REASONING &amp; TRACE</w:t>
+      </w:r>
+    </w:p>
     <w:p>
       <w:pPr>
         <w:spacing w:before="80"/>
       </w:pPr>
+      <w:r>
+        <w:rPr>
+          <w:noProof/>
+        </w:rPr>
+        <w:drawing>
+          <wp:inline distT="0" distB="0" distL="0" distR="0" wp14:anchorId="440496EE" wp14:editId="1C5745CC">
+            <wp:extent cx="6375400" cy="3248297"/>
+            <wp:effectExtent l="0" t="0" r="0" b="3175"/>
+            <wp:docPr id="584270728" name="Picture 5"/>
+            <wp:cNvGraphicFramePr>
+              <a:graphicFrameLocks xmlns:a="http://schemas.openxmlformats.org/drawingml/2006/main" noChangeAspect="1"/>
+            </wp:cNvGraphicFramePr>
+            <a:graphic xmlns:a="http://schemas.openxmlformats.org/drawingml/2006/main">
+              <a:graphicData uri="http://schemas.openxmlformats.org/drawingml/2006/picture">
+                <pic:pic xmlns:pic="http://schemas.openxmlformats.org/drawingml/2006/picture">
+                  <pic:nvPicPr>
+                    <pic:cNvPr id="584270728" name="Picture 584270728"/>
+                    <pic:cNvPicPr/>
+                  </pic:nvPicPr>
+                  <pic:blipFill>
+                    <a:blip r:embed="rId10" cstate="print">
+                      <a:extLst>
+                        <a:ext uri="{28A0092B-C50C-407E-A947-70E740481C1C}">
+                          <a14:useLocalDpi xmlns:a14="http://schemas.microsoft.com/office/drawing/2010/main" val="0"/>
+                        </a:ext>
+                      </a:extLst>
+                    </a:blip>
+                    <a:stretch>
+                      <a:fillRect/>
+                    </a:stretch>
+                  </pic:blipFill>
+                  <pic:spPr>
+                    <a:xfrm>
+                      <a:off x="0" y="0"/>
+                      <a:ext cx="6413419" cy="3267668"/>
+                    </a:xfrm>
+                    <a:prstGeom prst="rect">
+                      <a:avLst/>
+                    </a:prstGeom>
+                  </pic:spPr>
+                </pic:pic>
+              </a:graphicData>
+            </a:graphic>
+          </wp:inline>
+        </w:drawing>
+      </w:r>
     </w:p>
     <w:p>
       <w:pPr>
@@ -3741,261 +2499,8 @@
           <w:sz w:val="22"/>
           <w:szCs w:val="22"/>
         </w:rPr>
-        <w:t>Highlighted Aligned Skills</w:t>
-      </w:r>
-    </w:p>
-    <w:tbl>
-      <w:tblPr>
-        <w:tblW w:w="9360" w:type="dxa"/>
-        <w:tblBorders>
-          <w:top w:val="single" w:sz="4" w:space="0" w:color="auto"/>
-          <w:left w:val="single" w:sz="4" w:space="0" w:color="auto"/>
-          <w:bottom w:val="single" w:sz="4" w:space="0" w:color="auto"/>
-          <w:right w:val="single" w:sz="4" w:space="0" w:color="auto"/>
-          <w:insideH w:val="single" w:sz="4" w:space="0" w:color="auto"/>
-          <w:insideV w:val="single" w:sz="4" w:space="0" w:color="auto"/>
-        </w:tblBorders>
-        <w:tblCellMar>
-          <w:left w:w="10" w:type="dxa"/>
-          <w:right w:w="10" w:type="dxa"/>
-        </w:tblCellMar>
-        <w:tblLook w:val="0000" w:firstRow="0" w:lastRow="0" w:firstColumn="0" w:lastColumn="0" w:noHBand="0" w:noVBand="0"/>
-      </w:tblPr>
-      <w:tblGrid>
-        <w:gridCol w:w="9360"/>
-      </w:tblGrid>
-      <w:tr>
-        <w:tblPrEx>
-          <w:tblCellMar>
-            <w:top w:w="0" w:type="dxa"/>
-            <w:bottom w:w="0" w:type="dxa"/>
-          </w:tblCellMar>
-        </w:tblPrEx>
-        <w:tc>
-          <w:tcPr>
-            <w:tcW w:w="9360" w:type="dxa"/>
-            <w:tcBorders>
-              <w:top w:val="none" w:sz="0" w:space="0" w:color="FFFFFF"/>
-              <w:left w:val="none" w:sz="0" w:space="0" w:color="FFFFFF"/>
-              <w:bottom w:val="none" w:sz="0" w:space="0" w:color="FFFFFF"/>
-              <w:right w:val="none" w:sz="0" w:space="0" w:color="FFFFFF"/>
-            </w:tcBorders>
-            <w:shd w:val="clear" w:color="auto" w:fill="FFF8E6"/>
-            <w:tcMar>
-              <w:top w:w="60" w:type="dxa"/>
-              <w:left w:w="180" w:type="dxa"/>
-              <w:bottom w:w="60" w:type="dxa"/>
-              <w:right w:w="180" w:type="dxa"/>
-            </w:tcMar>
-          </w:tcPr>
-          <w:p>
-            <w:pPr>
-              <w:spacing w:before="20" w:after="20"/>
-            </w:pPr>
-            <w:proofErr w:type="gramStart"/>
-            <w:r>
-              <w:rPr>
-                <w:rFonts w:ascii="Courier New" w:eastAsia="Courier New" w:hAnsi="Courier New" w:cs="Courier New"/>
-                <w:color w:val="333333"/>
-                <w:sz w:val="19"/>
-                <w:szCs w:val="19"/>
-              </w:rPr>
-              <w:t>Docker  |</w:t>
-            </w:r>
-            <w:proofErr w:type="gramEnd"/>
-            <w:r>
-              <w:rPr>
-                <w:rFonts w:ascii="Courier New" w:eastAsia="Courier New" w:hAnsi="Courier New" w:cs="Courier New"/>
-                <w:color w:val="333333"/>
-                <w:sz w:val="19"/>
-                <w:szCs w:val="19"/>
-              </w:rPr>
-              <w:t xml:space="preserve">  Deep </w:t>
-            </w:r>
-            <w:proofErr w:type="gramStart"/>
-            <w:r>
-              <w:rPr>
-                <w:rFonts w:ascii="Courier New" w:eastAsia="Courier New" w:hAnsi="Courier New" w:cs="Courier New"/>
-                <w:color w:val="333333"/>
-                <w:sz w:val="19"/>
-                <w:szCs w:val="19"/>
-              </w:rPr>
-              <w:t>Learning  |</w:t>
-            </w:r>
-            <w:proofErr w:type="gramEnd"/>
-            <w:r>
-              <w:rPr>
-                <w:rFonts w:ascii="Courier New" w:eastAsia="Courier New" w:hAnsi="Courier New" w:cs="Courier New"/>
-                <w:color w:val="333333"/>
-                <w:sz w:val="19"/>
-                <w:szCs w:val="19"/>
-              </w:rPr>
-              <w:t xml:space="preserve">  Machine </w:t>
-            </w:r>
-            <w:proofErr w:type="gramStart"/>
-            <w:r>
-              <w:rPr>
-                <w:rFonts w:ascii="Courier New" w:eastAsia="Courier New" w:hAnsi="Courier New" w:cs="Courier New"/>
-                <w:color w:val="333333"/>
-                <w:sz w:val="19"/>
-                <w:szCs w:val="19"/>
-              </w:rPr>
-              <w:t>Learning  |</w:t>
-            </w:r>
-            <w:proofErr w:type="gramEnd"/>
-            <w:r>
-              <w:rPr>
-                <w:rFonts w:ascii="Courier New" w:eastAsia="Courier New" w:hAnsi="Courier New" w:cs="Courier New"/>
-                <w:color w:val="333333"/>
-                <w:sz w:val="19"/>
-                <w:szCs w:val="19"/>
-              </w:rPr>
-              <w:t xml:space="preserve">  </w:t>
-            </w:r>
-            <w:proofErr w:type="spellStart"/>
-            <w:proofErr w:type="gramStart"/>
-            <w:r>
-              <w:rPr>
-                <w:rFonts w:ascii="Courier New" w:eastAsia="Courier New" w:hAnsi="Courier New" w:cs="Courier New"/>
-                <w:color w:val="333333"/>
-                <w:sz w:val="19"/>
-                <w:szCs w:val="19"/>
-              </w:rPr>
-              <w:t>PyTorch</w:t>
-            </w:r>
-            <w:proofErr w:type="spellEnd"/>
-            <w:r>
-              <w:rPr>
-                <w:rFonts w:ascii="Courier New" w:eastAsia="Courier New" w:hAnsi="Courier New" w:cs="Courier New"/>
-                <w:color w:val="333333"/>
-                <w:sz w:val="19"/>
-                <w:szCs w:val="19"/>
-              </w:rPr>
-              <w:t xml:space="preserve">  |</w:t>
-            </w:r>
-            <w:proofErr w:type="gramEnd"/>
-            <w:r>
-              <w:rPr>
-                <w:rFonts w:ascii="Courier New" w:eastAsia="Courier New" w:hAnsi="Courier New" w:cs="Courier New"/>
-                <w:color w:val="333333"/>
-                <w:sz w:val="19"/>
-                <w:szCs w:val="19"/>
-              </w:rPr>
-              <w:t xml:space="preserve">  </w:t>
-            </w:r>
-            <w:proofErr w:type="gramStart"/>
-            <w:r>
-              <w:rPr>
-                <w:rFonts w:ascii="Courier New" w:eastAsia="Courier New" w:hAnsi="Courier New" w:cs="Courier New"/>
-                <w:color w:val="333333"/>
-                <w:sz w:val="19"/>
-                <w:szCs w:val="19"/>
-              </w:rPr>
-              <w:t>NLP  |</w:t>
-            </w:r>
-            <w:proofErr w:type="gramEnd"/>
-            <w:r>
-              <w:rPr>
-                <w:rFonts w:ascii="Courier New" w:eastAsia="Courier New" w:hAnsi="Courier New" w:cs="Courier New"/>
-                <w:color w:val="333333"/>
-                <w:sz w:val="19"/>
-                <w:szCs w:val="19"/>
-              </w:rPr>
-              <w:t xml:space="preserve">  </w:t>
-            </w:r>
-            <w:proofErr w:type="gramStart"/>
-            <w:r>
-              <w:rPr>
-                <w:rFonts w:ascii="Courier New" w:eastAsia="Courier New" w:hAnsi="Courier New" w:cs="Courier New"/>
-                <w:color w:val="333333"/>
-                <w:sz w:val="19"/>
-                <w:szCs w:val="19"/>
-              </w:rPr>
-              <w:t>Python  |</w:t>
-            </w:r>
-            <w:proofErr w:type="gramEnd"/>
-            <w:r>
-              <w:rPr>
-                <w:rFonts w:ascii="Courier New" w:eastAsia="Courier New" w:hAnsi="Courier New" w:cs="Courier New"/>
-                <w:color w:val="333333"/>
-                <w:sz w:val="19"/>
-                <w:szCs w:val="19"/>
-              </w:rPr>
-              <w:t xml:space="preserve">  </w:t>
-            </w:r>
-            <w:proofErr w:type="gramStart"/>
-            <w:r>
-              <w:rPr>
-                <w:rFonts w:ascii="Courier New" w:eastAsia="Courier New" w:hAnsi="Courier New" w:cs="Courier New"/>
-                <w:color w:val="333333"/>
-                <w:sz w:val="19"/>
-                <w:szCs w:val="19"/>
-              </w:rPr>
-              <w:t>TensorFlow  |</w:t>
-            </w:r>
-            <w:proofErr w:type="gramEnd"/>
-            <w:r>
-              <w:rPr>
-                <w:rFonts w:ascii="Courier New" w:eastAsia="Courier New" w:hAnsi="Courier New" w:cs="Courier New"/>
-                <w:color w:val="333333"/>
-                <w:sz w:val="19"/>
-                <w:szCs w:val="19"/>
-              </w:rPr>
-              <w:t xml:space="preserve">  scikit-</w:t>
-            </w:r>
-            <w:proofErr w:type="gramStart"/>
-            <w:r>
-              <w:rPr>
-                <w:rFonts w:ascii="Courier New" w:eastAsia="Courier New" w:hAnsi="Courier New" w:cs="Courier New"/>
-                <w:color w:val="333333"/>
-                <w:sz w:val="19"/>
-                <w:szCs w:val="19"/>
-              </w:rPr>
-              <w:t>learn  |</w:t>
-            </w:r>
-            <w:proofErr w:type="gramEnd"/>
-            <w:r>
-              <w:rPr>
-                <w:rFonts w:ascii="Courier New" w:eastAsia="Courier New" w:hAnsi="Courier New" w:cs="Courier New"/>
-                <w:color w:val="333333"/>
-                <w:sz w:val="19"/>
-                <w:szCs w:val="19"/>
-              </w:rPr>
-              <w:t xml:space="preserve">  </w:t>
-            </w:r>
-            <w:proofErr w:type="gramStart"/>
-            <w:r>
-              <w:rPr>
-                <w:rFonts w:ascii="Courier New" w:eastAsia="Courier New" w:hAnsi="Courier New" w:cs="Courier New"/>
-                <w:color w:val="333333"/>
-                <w:sz w:val="19"/>
-                <w:szCs w:val="19"/>
-              </w:rPr>
-              <w:t>AWS  |</w:t>
-            </w:r>
-            <w:proofErr w:type="gramEnd"/>
-            <w:r>
-              <w:rPr>
-                <w:rFonts w:ascii="Courier New" w:eastAsia="Courier New" w:hAnsi="Courier New" w:cs="Courier New"/>
-                <w:color w:val="333333"/>
-                <w:sz w:val="19"/>
-                <w:szCs w:val="19"/>
-              </w:rPr>
-              <w:t xml:space="preserve">  Git</w:t>
-            </w:r>
-          </w:p>
-        </w:tc>
-      </w:tr>
-    </w:tbl>
-    <w:p>
-      <w:pPr>
-        <w:spacing w:before="80"/>
-      </w:pPr>
-    </w:p>
-    <w:p>
-      <w:pPr>
-        <w:spacing w:before="140" w:after="60"/>
-      </w:pPr>
+        <w:t xml:space="preserve">Highlighted Aligned </w:t>
+      </w:r>
       <w:r>
         <w:rPr>
           <w:b/>
@@ -4004,177 +2509,63 @@
           <w:sz w:val="22"/>
           <w:szCs w:val="22"/>
         </w:rPr>
+        <w:t xml:space="preserve">Skills and </w:t>
+      </w:r>
+      <w:r>
+        <w:rPr>
+          <w:b/>
+          <w:bCs/>
+          <w:color w:val="2E75B6"/>
+          <w:sz w:val="22"/>
+          <w:szCs w:val="22"/>
+        </w:rPr>
         <w:t>Modified Experience Bullets (exactly 2)</w:t>
       </w:r>
-    </w:p>
-    <w:tbl>
-      <w:tblPr>
-        <w:tblW w:w="9360" w:type="dxa"/>
-        <w:tblBorders>
-          <w:top w:val="single" w:sz="4" w:space="0" w:color="auto"/>
-          <w:left w:val="single" w:sz="4" w:space="0" w:color="auto"/>
-          <w:bottom w:val="single" w:sz="4" w:space="0" w:color="auto"/>
-          <w:right w:val="single" w:sz="4" w:space="0" w:color="auto"/>
-          <w:insideH w:val="single" w:sz="4" w:space="0" w:color="auto"/>
-          <w:insideV w:val="single" w:sz="4" w:space="0" w:color="auto"/>
-        </w:tblBorders>
-        <w:tblCellMar>
-          <w:left w:w="10" w:type="dxa"/>
-          <w:right w:w="10" w:type="dxa"/>
-        </w:tblCellMar>
-        <w:tblLook w:val="0000" w:firstRow="0" w:lastRow="0" w:firstColumn="0" w:lastColumn="0" w:noHBand="0" w:noVBand="0"/>
-      </w:tblPr>
-      <w:tblGrid>
-        <w:gridCol w:w="960"/>
-        <w:gridCol w:w="8400"/>
-      </w:tblGrid>
-      <w:tr>
-        <w:tblPrEx>
-          <w:tblCellMar>
-            <w:top w:w="0" w:type="dxa"/>
-            <w:bottom w:w="0" w:type="dxa"/>
-          </w:tblCellMar>
-        </w:tblPrEx>
-        <w:tc>
-          <w:tcPr>
-            <w:tcW w:w="960" w:type="dxa"/>
-            <w:tcBorders>
-              <w:top w:val="single" w:sz="1" w:space="0" w:color="CCCCCC"/>
-              <w:left w:val="single" w:sz="1" w:space="0" w:color="CCCCCC"/>
-              <w:bottom w:val="single" w:sz="1" w:space="0" w:color="CCCCCC"/>
-              <w:right w:val="single" w:sz="1" w:space="0" w:color="CCCCCC"/>
-            </w:tcBorders>
-            <w:shd w:val="clear" w:color="auto" w:fill="FFFFFF"/>
-            <w:tcMar>
-              <w:top w:w="70" w:type="dxa"/>
-              <w:left w:w="120" w:type="dxa"/>
-              <w:bottom w:w="70" w:type="dxa"/>
-              <w:right w:w="120" w:type="dxa"/>
-            </w:tcMar>
-          </w:tcPr>
-          <w:p>
-            <w:r>
-              <w:rPr>
-                <w:b/>
-                <w:bCs/>
-                <w:sz w:val="19"/>
-                <w:szCs w:val="19"/>
-              </w:rPr>
-              <w:t>Bullet 1</w:t>
-            </w:r>
-          </w:p>
-        </w:tc>
-        <w:tc>
-          <w:tcPr>
-            <w:tcW w:w="8400" w:type="dxa"/>
-            <w:tcBorders>
-              <w:top w:val="single" w:sz="1" w:space="0" w:color="CCCCCC"/>
-              <w:left w:val="single" w:sz="1" w:space="0" w:color="CCCCCC"/>
-              <w:bottom w:val="single" w:sz="1" w:space="0" w:color="CCCCCC"/>
-              <w:right w:val="single" w:sz="1" w:space="0" w:color="CCCCCC"/>
-            </w:tcBorders>
-            <w:shd w:val="clear" w:color="auto" w:fill="FFFFFF"/>
-            <w:tcMar>
-              <w:top w:w="70" w:type="dxa"/>
-              <w:left w:w="120" w:type="dxa"/>
-              <w:bottom w:w="70" w:type="dxa"/>
-              <w:right w:w="120" w:type="dxa"/>
-            </w:tcMar>
-          </w:tcPr>
-          <w:p>
-            <w:r>
-              <w:rPr>
-                <w:sz w:val="19"/>
-                <w:szCs w:val="19"/>
-              </w:rPr>
-              <w:t>Led delivery of AI/ML solutions using Docker, Deep Learning, and Machine Learning, aligned with the Machine Learning Engineer target role.</w:t>
-            </w:r>
-          </w:p>
-        </w:tc>
-      </w:tr>
-      <w:tr>
-        <w:tblPrEx>
-          <w:tblCellMar>
-            <w:top w:w="0" w:type="dxa"/>
-            <w:bottom w:w="0" w:type="dxa"/>
-          </w:tblCellMar>
-        </w:tblPrEx>
-        <w:tc>
-          <w:tcPr>
-            <w:tcW w:w="960" w:type="dxa"/>
-            <w:tcBorders>
-              <w:top w:val="single" w:sz="1" w:space="0" w:color="CCCCCC"/>
-              <w:left w:val="single" w:sz="1" w:space="0" w:color="CCCCCC"/>
-              <w:bottom w:val="single" w:sz="1" w:space="0" w:color="CCCCCC"/>
-              <w:right w:val="single" w:sz="1" w:space="0" w:color="CCCCCC"/>
-            </w:tcBorders>
-            <w:shd w:val="clear" w:color="auto" w:fill="F0FFF4"/>
-            <w:tcMar>
-              <w:top w:w="70" w:type="dxa"/>
-              <w:left w:w="120" w:type="dxa"/>
-              <w:bottom w:w="70" w:type="dxa"/>
-              <w:right w:w="120" w:type="dxa"/>
-            </w:tcMar>
-          </w:tcPr>
-          <w:p>
-            <w:r>
-              <w:rPr>
-                <w:b/>
-                <w:bCs/>
-                <w:sz w:val="19"/>
-                <w:szCs w:val="19"/>
-              </w:rPr>
-              <w:t>Bullet 2</w:t>
-            </w:r>
-          </w:p>
-        </w:tc>
-        <w:tc>
-          <w:tcPr>
-            <w:tcW w:w="8400" w:type="dxa"/>
-            <w:tcBorders>
-              <w:top w:val="single" w:sz="1" w:space="0" w:color="CCCCCC"/>
-              <w:left w:val="single" w:sz="1" w:space="0" w:color="CCCCCC"/>
-              <w:bottom w:val="single" w:sz="1" w:space="0" w:color="CCCCCC"/>
-              <w:right w:val="single" w:sz="1" w:space="0" w:color="CCCCCC"/>
-            </w:tcBorders>
-            <w:shd w:val="clear" w:color="auto" w:fill="F0FFF4"/>
-            <w:tcMar>
-              <w:top w:w="70" w:type="dxa"/>
-              <w:left w:w="120" w:type="dxa"/>
-              <w:bottom w:w="70" w:type="dxa"/>
-              <w:right w:w="120" w:type="dxa"/>
-            </w:tcMar>
-          </w:tcPr>
-          <w:p>
-            <w:r>
-              <w:rPr>
-                <w:sz w:val="19"/>
-                <w:szCs w:val="19"/>
-              </w:rPr>
-              <w:t>Improved model and pipeline performance; experience directly relevant to the Machine Learning Engineer position at Get Offers.</w:t>
-            </w:r>
-          </w:p>
-        </w:tc>
-      </w:tr>
-    </w:tbl>
-    <w:p>
-      <w:pPr>
-        <w:spacing w:before="60"/>
-      </w:pPr>
-    </w:p>
-    <w:p>
-      <w:pPr>
-        <w:spacing w:before="40" w:after="60"/>
-      </w:pPr>
-      <w:r>
-        <w:rPr>
-          <w:i/>
-          <w:iCs/>
-          <w:color w:val="777777"/>
-          <w:sz w:val="18"/>
-          <w:szCs w:val="18"/>
-        </w:rPr>
-        <w:t>Note: only the summary and these 2 bullets were modified. All other sections remain unchanged.</w:t>
+      <w:r>
+        <w:rPr>
+          <w:noProof/>
+        </w:rPr>
+        <w:drawing>
+          <wp:inline distT="0" distB="0" distL="0" distR="0" wp14:anchorId="507C4A01" wp14:editId="3536BB94">
+            <wp:extent cx="6375400" cy="4427220"/>
+            <wp:effectExtent l="0" t="0" r="0" b="5080"/>
+            <wp:docPr id="2126284355" name="Picture 4"/>
+            <wp:cNvGraphicFramePr>
+              <a:graphicFrameLocks xmlns:a="http://schemas.openxmlformats.org/drawingml/2006/main" noChangeAspect="1"/>
+            </wp:cNvGraphicFramePr>
+            <a:graphic xmlns:a="http://schemas.openxmlformats.org/drawingml/2006/main">
+              <a:graphicData uri="http://schemas.openxmlformats.org/drawingml/2006/picture">
+                <pic:pic xmlns:pic="http://schemas.openxmlformats.org/drawingml/2006/picture">
+                  <pic:nvPicPr>
+                    <pic:cNvPr id="2126284355" name="Picture 2126284355"/>
+                    <pic:cNvPicPr/>
+                  </pic:nvPicPr>
+                  <pic:blipFill>
+                    <a:blip r:embed="rId11" cstate="print">
+                      <a:extLst>
+                        <a:ext uri="{28A0092B-C50C-407E-A947-70E740481C1C}">
+                          <a14:useLocalDpi xmlns:a14="http://schemas.microsoft.com/office/drawing/2010/main" val="0"/>
+                        </a:ext>
+                      </a:extLst>
+                    </a:blip>
+                    <a:stretch>
+                      <a:fillRect/>
+                    </a:stretch>
+                  </pic:blipFill>
+                  <pic:spPr>
+                    <a:xfrm>
+                      <a:off x="0" y="0"/>
+                      <a:ext cx="6375400" cy="4427220"/>
+                    </a:xfrm>
+                    <a:prstGeom prst="rect">
+                      <a:avLst/>
+                    </a:prstGeom>
+                  </pic:spPr>
+                </pic:pic>
+              </a:graphicData>
+            </a:graphic>
+          </wp:inline>
+        </w:drawing>
       </w:r>
     </w:p>
     <w:p>
@@ -4192,6 +2583,7 @@
           <w:sz w:val="26"/>
           <w:szCs w:val="26"/>
         </w:rPr>
+        <w:lastRenderedPageBreak/>
         <w:t>6. Ethics Reflection</w:t>
       </w:r>
     </w:p>
@@ -4207,7 +2599,6 @@
           <w:sz w:val="22"/>
           <w:szCs w:val="22"/>
         </w:rPr>
-        <w:lastRenderedPageBreak/>
         <w:t>Bias in Filtering and Ranking</w:t>
       </w:r>
     </w:p>
@@ -4216,7 +2607,7 @@
         <w:spacing w:before="40" w:after="60"/>
       </w:pPr>
       <w:r>
-        <w:t>The FAANG exclusion list encodes a specific career preference that may not suit all candidates. The 35% weight on skill matching can disadvantage applicants from non-traditional backgrounds who use different terminology for equivalent skills. Synonym matching partially mitigates this, but production deployments should audit ranking outcomes across demographic groups to detect emergent bias.</w:t>
+        <w:t>The 35% weight on skill matching can disadvantage applicants from non-traditional backgrounds who use different terminology for equivalent skills. Synonym matching partially mitigates this, but production deployments should audit ranking outcomes across demographic groups to detect emergent bias.</w:t>
       </w:r>
     </w:p>
     <w:p>
@@ -4312,8 +2703,8 @@
       </w:r>
     </w:p>
     <w:sectPr>
-      <w:headerReference w:type="default" r:id="rId7"/>
-      <w:footerReference w:type="default" r:id="rId8"/>
+      <w:headerReference w:type="default" r:id="rId12"/>
+      <w:footerReference w:type="default" r:id="rId13"/>
       <w:pgSz w:w="12240" w:h="15840"/>
       <w:pgMar w:top="900" w:right="1100" w:bottom="900" w:left="1100" w:header="708" w:footer="708" w:gutter="0"/>
       <w:cols w:space="720"/>

</xml_diff>